<commit_message>
Update Firmenbrief Word template
Co-Authored-By: Claude Sonnet 4.6 <noreply@anthropic.com>
</commit_message>
<xml_diff>
--- a/Brief an neue Firmen.docx
+++ b/Brief an neue Firmen.docx
@@ -20,7 +20,7 @@
           <w:szCs w:val="22"/>
         </w:rPr>
         <w:drawing>
-          <wp:anchor distT="0" distB="0" distL="114300" distR="114300" simplePos="0" relativeHeight="251658240" behindDoc="1" locked="0" layoutInCell="1" allowOverlap="1" wp14:anchorId="067DC30C" wp14:editId="1130B477">
+          <wp:anchor distT="0" distB="0" distL="114300" distR="114300" simplePos="0" relativeHeight="251658240" behindDoc="1" locked="0" layoutInCell="1" allowOverlap="1" wp14:anchorId="067DC30C" wp14:editId="6E556EB5">
             <wp:simplePos x="0" y="0"/>
             <wp:positionH relativeFrom="margin">
               <wp:posOffset>2693035</wp:posOffset>
@@ -81,6 +81,7 @@
           </wp:anchor>
         </w:drawing>
       </w:r>
+      <w:proofErr w:type="spellStart"/>
       <w:r>
         <w:rPr>
           <w:rFonts w:ascii="Arial" w:hAnsi="Arial" w:cs="Arial"/>
@@ -88,7 +89,17 @@
           <w:szCs w:val="22"/>
           <w:lang w:val="it-CH"/>
         </w:rPr>
-        <w:t>Confidio GmbH</w:t>
+        <w:t>Confidio</w:t>
+      </w:r>
+      <w:proofErr w:type="spellEnd"/>
+      <w:r>
+        <w:rPr>
+          <w:rFonts w:ascii="Arial" w:hAnsi="Arial" w:cs="Arial"/>
+          <w:sz w:val="22"/>
+          <w:szCs w:val="22"/>
+          <w:lang w:val="it-CH"/>
+        </w:rPr>
+        <w:t xml:space="preserve"> GmbH</w:t>
       </w:r>
     </w:p>
     <w:p>
@@ -101,6 +112,7 @@
           <w:lang w:val="it-CH"/>
         </w:rPr>
       </w:pPr>
+      <w:proofErr w:type="spellStart"/>
       <w:r>
         <w:rPr>
           <w:rFonts w:ascii="Arial" w:hAnsi="Arial" w:cs="Arial"/>
@@ -108,7 +120,17 @@
           <w:szCs w:val="22"/>
           <w:lang w:val="it-CH"/>
         </w:rPr>
-        <w:t>Grabenstrasse 15a</w:t>
+        <w:t>Grabenstrasse</w:t>
+      </w:r>
+      <w:proofErr w:type="spellEnd"/>
+      <w:r>
+        <w:rPr>
+          <w:rFonts w:ascii="Arial" w:hAnsi="Arial" w:cs="Arial"/>
+          <w:sz w:val="22"/>
+          <w:szCs w:val="22"/>
+          <w:lang w:val="it-CH"/>
+        </w:rPr>
+        <w:t xml:space="preserve"> 15a</w:t>
       </w:r>
     </w:p>
     <w:p>
@@ -281,7 +303,7 @@
           <w:sz w:val="22"/>
           <w:szCs w:val="22"/>
         </w:rPr>
-        <w:t>März</w:t>
+        <w:t>April</w:t>
       </w:r>
       <w:r>
         <w:rPr>
@@ -340,8 +362,9 @@
           <w:sz w:val="22"/>
           <w:szCs w:val="22"/>
         </w:rPr>
-        <w:t>Ihr Partner für ma</w:t>
-      </w:r>
+        <w:t xml:space="preserve">Ihr Partner für </w:t>
+      </w:r>
+      <w:proofErr w:type="spellStart"/>
       <w:r>
         <w:rPr>
           <w:rFonts w:ascii="Arial" w:hAnsi="Arial" w:cs="Arial"/>
@@ -350,7 +373,7 @@
           <w:sz w:val="22"/>
           <w:szCs w:val="22"/>
         </w:rPr>
-        <w:t>ss</w:t>
+        <w:t>ma</w:t>
       </w:r>
       <w:r>
         <w:rPr>
@@ -360,7 +383,28 @@
           <w:sz w:val="22"/>
           <w:szCs w:val="22"/>
         </w:rPr>
-        <w:t xml:space="preserve">geschneiderte Dienstleistungen </w:t>
+        <w:t>ss</w:t>
+      </w:r>
+      <w:r>
+        <w:rPr>
+          <w:rFonts w:ascii="Arial" w:hAnsi="Arial" w:cs="Arial"/>
+          <w:b/>
+          <w:bCs/>
+          <w:sz w:val="22"/>
+          <w:szCs w:val="22"/>
+        </w:rPr>
+        <w:t>geschneiderte</w:t>
+      </w:r>
+      <w:proofErr w:type="spellEnd"/>
+      <w:r>
+        <w:rPr>
+          <w:rFonts w:ascii="Arial" w:hAnsi="Arial" w:cs="Arial"/>
+          <w:b/>
+          <w:bCs/>
+          <w:sz w:val="22"/>
+          <w:szCs w:val="22"/>
+        </w:rPr>
+        <w:t xml:space="preserve"> Dienstleistungen </w:t>
       </w:r>
     </w:p>
     <w:p>
@@ -697,7 +741,7 @@
           <w:szCs w:val="22"/>
           <w:lang w:val="de-CH"/>
         </w:rPr>
-        <w:t>unterstützen können. </w:t>
+        <w:t>unterstützen können.</w:t>
       </w:r>
     </w:p>
     <w:p>
@@ -730,8 +774,48 @@
           <w:szCs w:val="22"/>
           <w:lang w:val="de-CH"/>
         </w:rPr>
-        <w:t>E</w:t>
-      </w:r>
+        <w:t>Übrigens:</w:t>
+      </w:r>
+      <w:r>
+        <w:rPr>
+          <w:rFonts w:ascii="Arial" w:hAnsi="Arial" w:cs="Arial"/>
+          <w:sz w:val="22"/>
+          <w:szCs w:val="22"/>
+          <w:lang w:val="de-CH"/>
+        </w:rPr>
+        <w:t xml:space="preserve"> Auf unserer Website können Sie Ihre Firmenversicherungen bequem und unkompliziert direkt online anfragen – und Ihren Vertrag anschliessend digital unterzeichnen</w:t>
+      </w:r>
+      <w:r>
+        <w:rPr>
+          <w:rFonts w:ascii="Arial" w:hAnsi="Arial" w:cs="Arial"/>
+          <w:sz w:val="22"/>
+          <w:szCs w:val="22"/>
+          <w:lang w:val="de-CH"/>
+        </w:rPr>
+        <w:t>.</w:t>
+      </w:r>
+    </w:p>
+    <w:p>
+      <w:pPr>
+        <w:pStyle w:val="Emfngeradresse"/>
+        <w:rPr>
+          <w:rFonts w:ascii="Arial" w:hAnsi="Arial" w:cs="Arial"/>
+          <w:sz w:val="22"/>
+          <w:szCs w:val="22"/>
+          <w:lang w:val="de-CH"/>
+        </w:rPr>
+      </w:pPr>
+    </w:p>
+    <w:p>
+      <w:pPr>
+        <w:pStyle w:val="Emfngeradresse"/>
+        <w:rPr>
+          <w:rFonts w:ascii="Arial" w:hAnsi="Arial" w:cs="Arial"/>
+          <w:sz w:val="22"/>
+          <w:szCs w:val="22"/>
+          <w:lang w:val="de-CH"/>
+        </w:rPr>
+      </w:pPr>
       <w:r>
         <w:rPr>
           <w:rFonts w:ascii="Arial" w:hAnsi="Arial" w:cs="Arial"/>
@@ -741,7 +825,7 @@
           <w:szCs w:val="22"/>
           <w:lang w:val="de-CH"/>
         </w:rPr>
-        <w:t>-M</w:t>
+        <w:t>E</w:t>
       </w:r>
       <w:r>
         <w:rPr>
@@ -752,7 +836,7 @@
           <w:szCs w:val="22"/>
           <w:lang w:val="de-CH"/>
         </w:rPr>
-        <w:t>ail:</w:t>
+        <w:t>-M</w:t>
       </w:r>
       <w:r>
         <w:rPr>
@@ -763,7 +847,7 @@
           <w:szCs w:val="22"/>
           <w:lang w:val="de-CH"/>
         </w:rPr>
-        <w:t xml:space="preserve"> info@confidio.ch                        Website: https://www.confidio.ch/</w:t>
+        <w:t>ail:</w:t>
       </w:r>
       <w:r>
         <w:rPr>
@@ -774,6 +858,17 @@
           <w:szCs w:val="22"/>
           <w:lang w:val="de-CH"/>
         </w:rPr>
+        <w:t xml:space="preserve"> info@confidio.ch                        Website: https://www.confidio.ch/</w:t>
+      </w:r>
+      <w:r>
+        <w:rPr>
+          <w:rFonts w:ascii="Arial" w:hAnsi="Arial" w:cs="Arial"/>
+          <w:b/>
+          <w:bCs/>
+          <w:sz w:val="22"/>
+          <w:szCs w:val="22"/>
+          <w:lang w:val="de-CH"/>
+        </w:rPr>
         <w:br/>
       </w:r>
       <w:r>
@@ -817,6 +912,24 @@
           <w:lang w:val="de-CH"/>
         </w:rPr>
       </w:pPr>
+      <w:r>
+        <w:rPr>
+          <w:rFonts w:ascii="Arial" w:hAnsi="Arial" w:cs="Arial"/>
+          <w:sz w:val="22"/>
+          <w:szCs w:val="22"/>
+          <w:lang w:val="de-CH"/>
+        </w:rPr>
+        <w:br/>
+      </w:r>
+      <w:r>
+        <w:rPr>
+          <w:rFonts w:ascii="Arial" w:hAnsi="Arial" w:cs="Arial"/>
+          <w:sz w:val="22"/>
+          <w:szCs w:val="22"/>
+          <w:lang w:val="de-CH"/>
+        </w:rPr>
+        <w:t>Freundliche Grüsse</w:t>
+      </w:r>
     </w:p>
     <w:p>
       <w:pPr>
@@ -825,62 +938,94 @@
           <w:rFonts w:ascii="Arial" w:hAnsi="Arial" w:cs="Arial"/>
           <w:sz w:val="22"/>
           <w:szCs w:val="22"/>
-          <w:lang w:val="de-CH"/>
-        </w:rPr>
-      </w:pPr>
-      <w:r>
-        <w:rPr>
-          <w:rFonts w:ascii="Arial" w:hAnsi="Arial" w:cs="Arial"/>
-          <w:sz w:val="22"/>
-          <w:szCs w:val="22"/>
-          <w:lang w:val="de-CH"/>
-        </w:rPr>
-        <w:br/>
-      </w:r>
-      <w:r>
-        <w:rPr>
-          <w:rFonts w:ascii="Arial" w:hAnsi="Arial" w:cs="Arial"/>
-          <w:sz w:val="22"/>
-          <w:szCs w:val="22"/>
-          <w:lang w:val="de-CH"/>
-        </w:rPr>
-        <w:t>Freundliche Grüsse</w:t>
-      </w:r>
-    </w:p>
-    <w:p>
-      <w:pPr>
-        <w:pStyle w:val="Emfngeradresse"/>
-        <w:rPr>
-          <w:rFonts w:ascii="Arial" w:hAnsi="Arial" w:cs="Arial"/>
-          <w:sz w:val="22"/>
-          <w:szCs w:val="22"/>
-          <w:lang w:val="de-CH"/>
-        </w:rPr>
-      </w:pPr>
-    </w:p>
-    <w:p>
-      <w:pPr>
-        <w:pStyle w:val="Emfngeradresse"/>
-        <w:rPr>
-          <w:rFonts w:ascii="Arial" w:hAnsi="Arial" w:cs="Arial"/>
-          <w:sz w:val="22"/>
-          <w:szCs w:val="22"/>
         </w:rPr>
       </w:pPr>
       <w:r>
         <w:rPr>
           <w:noProof/>
-          <w:sz w:val="22"/>
-          <w:szCs w:val="22"/>
         </w:rPr>
         <w:drawing>
-          <wp:anchor distT="0" distB="0" distL="114300" distR="114300" simplePos="0" relativeHeight="251665408" behindDoc="1" locked="0" layoutInCell="1" allowOverlap="1" wp14:anchorId="243B0D16" wp14:editId="731A3BD0">
+          <wp:anchor distT="0" distB="0" distL="114300" distR="114300" simplePos="0" relativeHeight="251666432" behindDoc="0" locked="0" layoutInCell="1" allowOverlap="1" wp14:anchorId="7A7F90FE" wp14:editId="5445A82B">
             <wp:simplePos x="0" y="0"/>
             <wp:positionH relativeFrom="margin">
-              <wp:posOffset>3903132</wp:posOffset>
+              <wp:posOffset>4112741</wp:posOffset>
             </wp:positionH>
             <wp:positionV relativeFrom="paragraph">
-              <wp:posOffset>919267</wp:posOffset>
+              <wp:posOffset>778270</wp:posOffset>
+            </wp:positionV>
+            <wp:extent cx="1357630" cy="471819"/>
+            <wp:effectExtent l="0" t="0" r="0" b="4445"/>
+            <wp:wrapNone/>
+            <wp:docPr id="1660236486" name="Grafik 1" descr="Axa logo and symbol, meaning, history, PNG, brand"/>
+            <wp:cNvGraphicFramePr>
+              <a:graphicFrameLocks xmlns:a="http://schemas.openxmlformats.org/drawingml/2006/main" noChangeAspect="1"/>
+            </wp:cNvGraphicFramePr>
+            <a:graphic xmlns:a="http://schemas.openxmlformats.org/drawingml/2006/main">
+              <a:graphicData uri="http://schemas.openxmlformats.org/drawingml/2006/picture">
+                <pic:pic xmlns:pic="http://schemas.openxmlformats.org/drawingml/2006/picture">
+                  <pic:nvPicPr>
+                    <pic:cNvPr id="0" name="Picture 1" descr="Axa logo and symbol, meaning, history, PNG, brand"/>
+                    <pic:cNvPicPr>
+                      <a:picLocks noChangeAspect="1" noChangeArrowheads="1"/>
+                    </pic:cNvPicPr>
+                  </pic:nvPicPr>
+                  <pic:blipFill rotWithShape="1">
+                    <a:blip r:embed="rId11" cstate="print">
+                      <a:extLst>
+                        <a:ext uri="{28A0092B-C50C-407E-A947-70E740481C1C}">
+                          <a14:useLocalDpi xmlns:a14="http://schemas.microsoft.com/office/drawing/2010/main" val="0"/>
+                        </a:ext>
+                      </a:extLst>
+                    </a:blip>
+                    <a:srcRect t="26486" b="11748"/>
+                    <a:stretch>
+                      <a:fillRect/>
+                    </a:stretch>
+                  </pic:blipFill>
+                  <pic:spPr bwMode="auto">
+                    <a:xfrm>
+                      <a:off x="0" y="0"/>
+                      <a:ext cx="1369335" cy="475887"/>
+                    </a:xfrm>
+                    <a:prstGeom prst="rect">
+                      <a:avLst/>
+                    </a:prstGeom>
+                    <a:noFill/>
+                    <a:ln>
+                      <a:noFill/>
+                    </a:ln>
+                    <a:extLst>
+                      <a:ext uri="{53640926-AAD7-44D8-BBD7-CCE9431645EC}">
+                        <a14:shadowObscured xmlns:a14="http://schemas.microsoft.com/office/drawing/2010/main"/>
+                      </a:ext>
+                    </a:extLst>
+                  </pic:spPr>
+                </pic:pic>
+              </a:graphicData>
+            </a:graphic>
+            <wp14:sizeRelH relativeFrom="margin">
+              <wp14:pctWidth>0</wp14:pctWidth>
+            </wp14:sizeRelH>
+            <wp14:sizeRelV relativeFrom="margin">
+              <wp14:pctHeight>0</wp14:pctHeight>
+            </wp14:sizeRelV>
+          </wp:anchor>
+        </w:drawing>
+      </w:r>
+      <w:r>
+        <w:rPr>
+          <w:noProof/>
+          <w:sz w:val="22"/>
+          <w:szCs w:val="22"/>
+        </w:rPr>
+        <w:drawing>
+          <wp:anchor distT="0" distB="0" distL="114300" distR="114300" simplePos="0" relativeHeight="251665408" behindDoc="1" locked="0" layoutInCell="1" allowOverlap="1" wp14:anchorId="243B0D16" wp14:editId="11B9038E">
+            <wp:simplePos x="0" y="0"/>
+            <wp:positionH relativeFrom="margin">
+              <wp:posOffset>3268397</wp:posOffset>
+            </wp:positionH>
+            <wp:positionV relativeFrom="paragraph">
+              <wp:posOffset>954988</wp:posOffset>
             </wp:positionV>
             <wp:extent cx="689751" cy="293511"/>
             <wp:effectExtent l="0" t="0" r="0" b="0"/>
@@ -899,7 +1044,7 @@
                     </pic:cNvPicPr>
                   </pic:nvPicPr>
                   <pic:blipFill>
-                    <a:blip r:embed="rId11" cstate="print">
+                    <a:blip r:embed="rId12" cstate="print">
                       <a:extLst>
                         <a:ext uri="{28A0092B-C50C-407E-A947-70E740481C1C}">
                           <a14:useLocalDpi xmlns:a14="http://schemas.microsoft.com/office/drawing/2010/main" val="0"/>
@@ -913,7 +1058,7 @@
                   <pic:spPr bwMode="auto">
                     <a:xfrm>
                       <a:off x="0" y="0"/>
-                      <a:ext cx="710554" cy="302363"/>
+                      <a:ext cx="689751" cy="293511"/>
                     </a:xfrm>
                     <a:prstGeom prst="rect">
                       <a:avLst/>
@@ -942,81 +1087,13 @@
           <w:szCs w:val="22"/>
         </w:rPr>
         <w:drawing>
-          <wp:anchor distT="0" distB="0" distL="114300" distR="114300" simplePos="0" relativeHeight="251662336" behindDoc="1" locked="0" layoutInCell="1" allowOverlap="1" wp14:anchorId="399B35B4" wp14:editId="0F6AFDA1">
+          <wp:anchor distT="0" distB="0" distL="114300" distR="114300" simplePos="0" relativeHeight="251664384" behindDoc="1" locked="0" layoutInCell="1" allowOverlap="1" wp14:anchorId="24029FC9" wp14:editId="64E05CF7">
             <wp:simplePos x="0" y="0"/>
             <wp:positionH relativeFrom="margin">
-              <wp:posOffset>2841695</wp:posOffset>
+              <wp:posOffset>1744396</wp:posOffset>
             </wp:positionH>
             <wp:positionV relativeFrom="paragraph">
-              <wp:posOffset>323215</wp:posOffset>
-            </wp:positionV>
-            <wp:extent cx="1223285" cy="416681"/>
-            <wp:effectExtent l="0" t="0" r="0" b="2540"/>
-            <wp:wrapNone/>
-            <wp:docPr id="12" name="Bild 12"/>
-            <wp:cNvGraphicFramePr>
-              <a:graphicFrameLocks xmlns:a="http://schemas.openxmlformats.org/drawingml/2006/main" noChangeAspect="1"/>
-            </wp:cNvGraphicFramePr>
-            <a:graphic xmlns:a="http://schemas.openxmlformats.org/drawingml/2006/main">
-              <a:graphicData uri="http://schemas.openxmlformats.org/drawingml/2006/picture">
-                <pic:pic xmlns:pic="http://schemas.openxmlformats.org/drawingml/2006/picture">
-                  <pic:nvPicPr>
-                    <pic:cNvPr id="12" name="Bild 12"/>
-                    <pic:cNvPicPr>
-                      <a:picLocks noChangeAspect="1" noChangeArrowheads="1"/>
-                    </pic:cNvPicPr>
-                  </pic:nvPicPr>
-                  <pic:blipFill>
-                    <a:blip r:embed="rId12" cstate="print">
-                      <a:extLst>
-                        <a:ext uri="{28A0092B-C50C-407E-A947-70E740481C1C}">
-                          <a14:useLocalDpi xmlns:a14="http://schemas.microsoft.com/office/drawing/2010/main" val="0"/>
-                        </a:ext>
-                      </a:extLst>
-                    </a:blip>
-                    <a:stretch>
-                      <a:fillRect/>
-                    </a:stretch>
-                  </pic:blipFill>
-                  <pic:spPr bwMode="auto">
-                    <a:xfrm>
-                      <a:off x="0" y="0"/>
-                      <a:ext cx="1223285" cy="416681"/>
-                    </a:xfrm>
-                    <a:prstGeom prst="rect">
-                      <a:avLst/>
-                    </a:prstGeom>
-                    <a:noFill/>
-                    <a:ln>
-                      <a:noFill/>
-                    </a:ln>
-                  </pic:spPr>
-                </pic:pic>
-              </a:graphicData>
-            </a:graphic>
-            <wp14:sizeRelH relativeFrom="margin">
-              <wp14:pctWidth>0</wp14:pctWidth>
-            </wp14:sizeRelH>
-            <wp14:sizeRelV relativeFrom="margin">
-              <wp14:pctHeight>0</wp14:pctHeight>
-            </wp14:sizeRelV>
-          </wp:anchor>
-        </w:drawing>
-      </w:r>
-      <w:r>
-        <w:rPr>
-          <w:noProof/>
-          <w:sz w:val="22"/>
-          <w:szCs w:val="22"/>
-        </w:rPr>
-        <w:drawing>
-          <wp:anchor distT="0" distB="0" distL="114300" distR="114300" simplePos="0" relativeHeight="251664384" behindDoc="1" locked="0" layoutInCell="1" allowOverlap="1" wp14:anchorId="24029FC9" wp14:editId="26B52C23">
-            <wp:simplePos x="0" y="0"/>
-            <wp:positionH relativeFrom="margin">
-              <wp:posOffset>2074334</wp:posOffset>
-            </wp:positionH>
-            <wp:positionV relativeFrom="paragraph">
-              <wp:posOffset>970069</wp:posOffset>
+              <wp:posOffset>994359</wp:posOffset>
             </wp:positionV>
             <wp:extent cx="1207911" cy="243094"/>
             <wp:effectExtent l="0" t="0" r="0" b="0"/>
@@ -1078,13 +1155,13 @@
           <w:szCs w:val="22"/>
         </w:rPr>
         <w:drawing>
-          <wp:anchor distT="0" distB="0" distL="114300" distR="114300" simplePos="0" relativeHeight="251661312" behindDoc="1" locked="0" layoutInCell="1" allowOverlap="1" wp14:anchorId="58DCB06F" wp14:editId="2F273D6A">
+          <wp:anchor distT="0" distB="0" distL="114300" distR="114300" simplePos="0" relativeHeight="251661312" behindDoc="1" locked="0" layoutInCell="1" allowOverlap="1" wp14:anchorId="58DCB06F" wp14:editId="19D81562">
             <wp:simplePos x="0" y="0"/>
             <wp:positionH relativeFrom="margin">
-              <wp:posOffset>606778</wp:posOffset>
+              <wp:posOffset>416955</wp:posOffset>
             </wp:positionH>
             <wp:positionV relativeFrom="paragraph">
-              <wp:posOffset>907979</wp:posOffset>
+              <wp:posOffset>940367</wp:posOffset>
             </wp:positionV>
             <wp:extent cx="909947" cy="304942"/>
             <wp:effectExtent l="0" t="0" r="5080" b="0"/>
@@ -1117,7 +1194,75 @@
                   <pic:spPr bwMode="auto">
                     <a:xfrm>
                       <a:off x="0" y="0"/>
-                      <a:ext cx="916141" cy="307018"/>
+                      <a:ext cx="909947" cy="304942"/>
+                    </a:xfrm>
+                    <a:prstGeom prst="rect">
+                      <a:avLst/>
+                    </a:prstGeom>
+                    <a:noFill/>
+                    <a:ln>
+                      <a:noFill/>
+                    </a:ln>
+                  </pic:spPr>
+                </pic:pic>
+              </a:graphicData>
+            </a:graphic>
+            <wp14:sizeRelH relativeFrom="margin">
+              <wp14:pctWidth>0</wp14:pctWidth>
+            </wp14:sizeRelH>
+            <wp14:sizeRelV relativeFrom="margin">
+              <wp14:pctHeight>0</wp14:pctHeight>
+            </wp14:sizeRelV>
+          </wp:anchor>
+        </w:drawing>
+      </w:r>
+      <w:r>
+        <w:rPr>
+          <w:noProof/>
+          <w:sz w:val="22"/>
+          <w:szCs w:val="22"/>
+        </w:rPr>
+        <w:drawing>
+          <wp:anchor distT="0" distB="0" distL="114300" distR="114300" simplePos="0" relativeHeight="251662336" behindDoc="1" locked="0" layoutInCell="1" allowOverlap="1" wp14:anchorId="399B35B4" wp14:editId="5ADDE885">
+            <wp:simplePos x="0" y="0"/>
+            <wp:positionH relativeFrom="margin">
+              <wp:posOffset>2841695</wp:posOffset>
+            </wp:positionH>
+            <wp:positionV relativeFrom="paragraph">
+              <wp:posOffset>323215</wp:posOffset>
+            </wp:positionV>
+            <wp:extent cx="1223285" cy="416681"/>
+            <wp:effectExtent l="0" t="0" r="0" b="2540"/>
+            <wp:wrapNone/>
+            <wp:docPr id="12" name="Bild 12"/>
+            <wp:cNvGraphicFramePr>
+              <a:graphicFrameLocks xmlns:a="http://schemas.openxmlformats.org/drawingml/2006/main" noChangeAspect="1"/>
+            </wp:cNvGraphicFramePr>
+            <a:graphic xmlns:a="http://schemas.openxmlformats.org/drawingml/2006/main">
+              <a:graphicData uri="http://schemas.openxmlformats.org/drawingml/2006/picture">
+                <pic:pic xmlns:pic="http://schemas.openxmlformats.org/drawingml/2006/picture">
+                  <pic:nvPicPr>
+                    <pic:cNvPr id="12" name="Bild 12"/>
+                    <pic:cNvPicPr>
+                      <a:picLocks noChangeAspect="1" noChangeArrowheads="1"/>
+                    </pic:cNvPicPr>
+                  </pic:nvPicPr>
+                  <pic:blipFill>
+                    <a:blip r:embed="rId15" cstate="print">
+                      <a:extLst>
+                        <a:ext uri="{28A0092B-C50C-407E-A947-70E740481C1C}">
+                          <a14:useLocalDpi xmlns:a14="http://schemas.microsoft.com/office/drawing/2010/main" val="0"/>
+                        </a:ext>
+                      </a:extLst>
+                    </a:blip>
+                    <a:stretch>
+                      <a:fillRect/>
+                    </a:stretch>
+                  </pic:blipFill>
+                  <pic:spPr bwMode="auto">
+                    <a:xfrm>
+                      <a:off x="0" y="0"/>
+                      <a:ext cx="1223285" cy="416681"/>
                     </a:xfrm>
                     <a:prstGeom prst="rect">
                       <a:avLst/>
@@ -1171,7 +1316,7 @@
                     </pic:cNvPicPr>
                   </pic:nvPicPr>
                   <pic:blipFill rotWithShape="1">
-                    <a:blip r:embed="rId15" cstate="print">
+                    <a:blip r:embed="rId16" cstate="print">
                       <a:extLst>
                         <a:ext uri="{28A0092B-C50C-407E-A947-70E740481C1C}">
                           <a14:useLocalDpi xmlns:a14="http://schemas.microsoft.com/office/drawing/2010/main" val="0"/>
@@ -1245,7 +1390,7 @@
                     </pic:cNvPicPr>
                   </pic:nvPicPr>
                   <pic:blipFill>
-                    <a:blip r:embed="rId16" cstate="print">
+                    <a:blip r:embed="rId17" cstate="print">
                       <a:extLst>
                         <a:ext uri="{28A0092B-C50C-407E-A947-70E740481C1C}">
                           <a14:useLocalDpi xmlns:a14="http://schemas.microsoft.com/office/drawing/2010/main" val="0"/>
@@ -1310,7 +1455,7 @@
                     </pic:cNvPicPr>
                   </pic:nvPicPr>
                   <pic:blipFill>
-                    <a:blip r:embed="rId17" cstate="print">
+                    <a:blip r:embed="rId18" cstate="print">
                       <a:extLst>
                         <a:ext uri="{28A0092B-C50C-407E-A947-70E740481C1C}">
                           <a14:useLocalDpi xmlns:a14="http://schemas.microsoft.com/office/drawing/2010/main" val="0"/>
@@ -1356,18 +1501,29 @@
         </w:rPr>
         <w:t xml:space="preserve">Ihr </w:t>
       </w:r>
-      <w:r>
-        <w:rPr>
-          <w:rFonts w:ascii="Arial" w:hAnsi="Arial" w:cs="Arial"/>
-          <w:sz w:val="22"/>
-          <w:szCs w:val="22"/>
-          <w:lang w:val="de-CH"/>
-        </w:rPr>
-        <w:t>Confidio Team</w:t>
+      <w:proofErr w:type="spellStart"/>
+      <w:r>
+        <w:rPr>
+          <w:rFonts w:ascii="Arial" w:hAnsi="Arial" w:cs="Arial"/>
+          <w:sz w:val="22"/>
+          <w:szCs w:val="22"/>
+          <w:lang w:val="de-CH"/>
+        </w:rPr>
+        <w:t>Confidio</w:t>
+      </w:r>
+      <w:proofErr w:type="spellEnd"/>
+      <w:r>
+        <w:rPr>
+          <w:rFonts w:ascii="Arial" w:hAnsi="Arial" w:cs="Arial"/>
+          <w:sz w:val="22"/>
+          <w:szCs w:val="22"/>
+          <w:lang w:val="de-CH"/>
+        </w:rPr>
+        <w:t xml:space="preserve"> Team</w:t>
       </w:r>
     </w:p>
     <w:sectPr>
-      <w:footerReference w:type="default" r:id="rId18"/>
+      <w:footerReference w:type="default" r:id="rId19"/>
       <w:pgSz w:w="11907" w:h="16839"/>
       <w:pgMar w:top="1440" w:right="1800" w:bottom="1440" w:left="1800" w:header="720" w:footer="720" w:gutter="0"/>
       <w:pgBorders w:offsetFrom="page">
@@ -1417,6 +1573,7 @@
         <w:lang w:val="it-IT"/>
       </w:rPr>
     </w:pPr>
+    <w:proofErr w:type="spellStart"/>
     <w:r>
       <w:rPr>
         <w:rFonts w:ascii="Arial" w:hAnsi="Arial" w:cs="Arial"/>
@@ -1424,7 +1581,17 @@
         <w:szCs w:val="20"/>
         <w:lang w:val="it-IT"/>
       </w:rPr>
-      <w:t xml:space="preserve">Confidio </w:t>
+      <w:t>Confidio</w:t>
+    </w:r>
+    <w:proofErr w:type="spellEnd"/>
+    <w:r>
+      <w:rPr>
+        <w:rFonts w:ascii="Arial" w:hAnsi="Arial" w:cs="Arial"/>
+        <w:sz w:val="20"/>
+        <w:szCs w:val="20"/>
+        <w:lang w:val="it-IT"/>
+      </w:rPr>
+      <w:t xml:space="preserve"> </w:t>
     </w:r>
     <w:r>
       <w:rPr>

</xml_diff>

<commit_message>
Update template to v2: konkreterer Betreff, Pflichtversicherungen, CTA, Opt-out-Footer
Co-Authored-By: Claude Sonnet 4.6 <noreply@anthropic.com>
</commit_message>
<xml_diff>
--- a/Brief an neue Firmen.docx
+++ b/Brief an neue Firmen.docx
@@ -362,7 +362,7 @@
           <w:sz w:val="22"/>
           <w:szCs w:val="22"/>
         </w:rPr>
-        <w:t xml:space="preserve">Ihr Partner für </w:t>
+        <w:t>Pflichtversicherungen für Ihre neue Firma – jetzt in 3 Minuten online anfragen</w:t>
       </w:r>
       <w:proofErr w:type="spellStart"/>
       <w:r>
@@ -373,7 +373,6 @@
           <w:sz w:val="22"/>
           <w:szCs w:val="22"/>
         </w:rPr>
-        <w:t>ma</w:t>
       </w:r>
       <w:r>
         <w:rPr>
@@ -383,7 +382,6 @@
           <w:sz w:val="22"/>
           <w:szCs w:val="22"/>
         </w:rPr>
-        <w:t>ss</w:t>
       </w:r>
       <w:r>
         <w:rPr>
@@ -393,7 +391,6 @@
           <w:sz w:val="22"/>
           <w:szCs w:val="22"/>
         </w:rPr>
-        <w:t>geschneiderte</w:t>
       </w:r>
       <w:proofErr w:type="spellEnd"/>
       <w:r>
@@ -404,7 +401,6 @@
           <w:sz w:val="22"/>
           <w:szCs w:val="22"/>
         </w:rPr>
-        <w:t xml:space="preserve"> Dienstleistungen </w:t>
       </w:r>
     </w:p>
     <w:p>
@@ -446,1080 +442,219 @@
     <w:p>
       <w:pPr>
         <w:pStyle w:val="Emfngeradresse"/>
-        <w:rPr>
-          <w:rFonts w:ascii="Arial" w:hAnsi="Arial" w:cs="Arial"/>
-          <w:sz w:val="22"/>
-          <w:szCs w:val="22"/>
-          <w:lang w:val="de-CH"/>
-        </w:rPr>
-      </w:pPr>
-      <w:r>
-        <w:rPr>
-          <w:rFonts w:ascii="Arial" w:hAnsi="Arial" w:cs="Arial"/>
-          <w:sz w:val="22"/>
-          <w:szCs w:val="22"/>
-          <w:lang w:val="de-CH"/>
-        </w:rPr>
-        <w:br/>
-      </w:r>
-      <w:r>
-        <w:rPr>
-          <w:rFonts w:ascii="Arial" w:hAnsi="Arial" w:cs="Arial"/>
-          <w:sz w:val="22"/>
-          <w:szCs w:val="22"/>
-          <w:lang w:val="de-CH"/>
-        </w:rPr>
-        <w:t>H</w:t>
-      </w:r>
-      <w:r>
-        <w:rPr>
-          <w:rFonts w:ascii="Arial" w:hAnsi="Arial" w:cs="Arial"/>
-          <w:sz w:val="22"/>
-          <w:szCs w:val="22"/>
-          <w:lang w:val="de-CH"/>
-        </w:rPr>
-        <w:t>erzlichen Glückwunsch zu Ihrer Unternehmensgründung! </w:t>
-      </w:r>
-      <w:r>
-        <w:rPr>
-          <w:rFonts w:ascii="Arial" w:hAnsi="Arial" w:cs="Arial"/>
-          <w:sz w:val="22"/>
-          <w:szCs w:val="22"/>
-          <w:lang w:val="de-CH"/>
-        </w:rPr>
-        <w:t xml:space="preserve"> </w:t>
-      </w:r>
-    </w:p>
-    <w:p>
-      <w:pPr>
-        <w:pStyle w:val="Emfngeradresse"/>
-        <w:rPr>
-          <w:rFonts w:ascii="Arial" w:hAnsi="Arial" w:cs="Arial"/>
-          <w:sz w:val="22"/>
-          <w:szCs w:val="22"/>
-          <w:lang w:val="de-CH"/>
-        </w:rPr>
-      </w:pPr>
-      <w:r>
-        <w:rPr>
-          <w:rFonts w:ascii="Arial" w:hAnsi="Arial" w:cs="Arial"/>
-          <w:sz w:val="22"/>
-          <w:szCs w:val="22"/>
-          <w:lang w:val="de-CH"/>
-        </w:rPr>
-        <w:br/>
-        <w:t>Als erfahrene Experten im Bereich Finanz- und Firmenberatung möchten wir</w:t>
-      </w:r>
-    </w:p>
-    <w:p>
-      <w:pPr>
-        <w:pStyle w:val="Emfngeradresse"/>
-        <w:rPr>
-          <w:rFonts w:ascii="Arial" w:hAnsi="Arial" w:cs="Arial"/>
-          <w:sz w:val="22"/>
-          <w:szCs w:val="22"/>
-          <w:lang w:val="de-CH"/>
-        </w:rPr>
-      </w:pPr>
-      <w:r>
-        <w:rPr>
-          <w:rFonts w:ascii="Arial" w:hAnsi="Arial" w:cs="Arial"/>
-          <w:sz w:val="22"/>
-          <w:szCs w:val="22"/>
-          <w:lang w:val="de-CH"/>
-        </w:rPr>
-        <w:t>Ihnen unsere Unterstützung anbieten. Unser Ziel ist es, Ihnen dabei zu </w:t>
-      </w:r>
-      <w:r>
-        <w:rPr>
-          <w:rFonts w:ascii="Arial" w:hAnsi="Arial" w:cs="Arial"/>
-          <w:sz w:val="22"/>
-          <w:szCs w:val="22"/>
-          <w:lang w:val="de-CH"/>
-        </w:rPr>
-        <w:t>helfen, die</w:t>
-      </w:r>
-      <w:r>
-        <w:rPr>
-          <w:rFonts w:ascii="Arial" w:hAnsi="Arial" w:cs="Arial"/>
-          <w:sz w:val="22"/>
-          <w:szCs w:val="22"/>
-          <w:lang w:val="de-CH"/>
-        </w:rPr>
-        <w:t> besten finanziellen Entscheidungen für Ihr Unternehmen zu treffen und </w:t>
-      </w:r>
-    </w:p>
-    <w:p>
-      <w:pPr>
-        <w:pStyle w:val="Emfngeradresse"/>
-        <w:rPr>
-          <w:rFonts w:ascii="Arial" w:hAnsi="Arial" w:cs="Arial"/>
-          <w:sz w:val="22"/>
-          <w:szCs w:val="22"/>
-          <w:lang w:val="de-CH"/>
-        </w:rPr>
-      </w:pPr>
-      <w:r>
-        <w:rPr>
-          <w:rFonts w:ascii="Arial" w:hAnsi="Arial" w:cs="Arial"/>
-          <w:sz w:val="22"/>
-          <w:szCs w:val="22"/>
-          <w:lang w:val="de-CH"/>
-        </w:rPr>
-        <w:t>von ma</w:t>
-      </w:r>
-      <w:r>
-        <w:rPr>
-          <w:rFonts w:ascii="Arial" w:hAnsi="Arial" w:cs="Arial"/>
-          <w:sz w:val="22"/>
-          <w:szCs w:val="22"/>
-          <w:lang w:val="de-CH"/>
-        </w:rPr>
-        <w:t>ss</w:t>
-      </w:r>
-      <w:r>
-        <w:rPr>
-          <w:rFonts w:ascii="Arial" w:hAnsi="Arial" w:cs="Arial"/>
-          <w:sz w:val="22"/>
-          <w:szCs w:val="22"/>
-          <w:lang w:val="de-CH"/>
-        </w:rPr>
-        <w:t>geschneiderten Lösungen zu profitieren, die auf Ihre Bedürfnisse </w:t>
-      </w:r>
-    </w:p>
-    <w:p>
-      <w:pPr>
-        <w:pStyle w:val="Emfngeradresse"/>
-        <w:rPr>
-          <w:rFonts w:ascii="Arial" w:hAnsi="Arial" w:cs="Arial"/>
-          <w:sz w:val="22"/>
-          <w:szCs w:val="22"/>
-          <w:lang w:val="de-CH"/>
-        </w:rPr>
-      </w:pPr>
-      <w:r>
-        <w:rPr>
-          <w:rFonts w:ascii="Arial" w:hAnsi="Arial" w:cs="Arial"/>
-          <w:sz w:val="22"/>
-          <w:szCs w:val="22"/>
-          <w:lang w:val="de-CH"/>
-        </w:rPr>
-        <w:t>abgestimmt sind.</w:t>
-      </w:r>
-      <w:r>
-        <w:rPr>
-          <w:rFonts w:ascii="Arial" w:hAnsi="Arial" w:cs="Arial"/>
-          <w:sz w:val="22"/>
-          <w:szCs w:val="22"/>
-          <w:lang w:val="de-CH"/>
-        </w:rPr>
-        <w:br/>
-      </w:r>
-      <w:r>
-        <w:rPr>
-          <w:rFonts w:ascii="Arial" w:hAnsi="Arial" w:cs="Arial"/>
-          <w:sz w:val="22"/>
-          <w:szCs w:val="22"/>
-          <w:lang w:val="de-CH"/>
-        </w:rPr>
-        <w:br/>
-      </w:r>
-      <w:r>
-        <w:rPr>
-          <w:rFonts w:ascii="Arial" w:hAnsi="Arial" w:cs="Arial"/>
-          <w:sz w:val="22"/>
-          <w:szCs w:val="22"/>
-          <w:lang w:val="de-CH"/>
-        </w:rPr>
-        <w:t>Durch unsere unabhängige Beratung erhalten Sie Zugang zu einer Vielzahl hochwertiger Produkte und Dienstleistungen</w:t>
-      </w:r>
-      <w:r>
-        <w:rPr>
-          <w:rFonts w:ascii="Arial" w:hAnsi="Arial" w:cs="Arial"/>
-          <w:sz w:val="22"/>
-          <w:szCs w:val="22"/>
-          <w:lang w:val="de-CH"/>
-        </w:rPr>
-        <w:t>,</w:t>
-      </w:r>
-      <w:r>
-        <w:rPr>
-          <w:rFonts w:ascii="Arial" w:hAnsi="Arial" w:cs="Arial"/>
-          <w:sz w:val="22"/>
-          <w:szCs w:val="22"/>
-          <w:lang w:val="de-CH"/>
-        </w:rPr>
-        <w:t xml:space="preserve"> darunter Firmenversicherungen wie die Berufshaftpflicht- und Rechtsschutzversicherung, die Unfallversicherung (UVG), die Krankentaggeldversicherung (KTG) sowie die Einrichtung der beruflichen Vorsorge (BVG) und der Pensionskasse.</w:t>
-      </w:r>
-    </w:p>
-    <w:p>
-      <w:pPr>
-        <w:pStyle w:val="Emfngeradresse"/>
-        <w:rPr>
-          <w:rFonts w:ascii="Arial" w:hAnsi="Arial" w:cs="Arial"/>
-          <w:sz w:val="22"/>
-          <w:szCs w:val="22"/>
-          <w:lang w:val="de-CH"/>
-        </w:rPr>
-      </w:pPr>
-    </w:p>
-    <w:p>
-      <w:pPr>
-        <w:pStyle w:val="Emfngeradresse"/>
-        <w:rPr>
-          <w:rFonts w:ascii="Arial" w:hAnsi="Arial" w:cs="Arial"/>
-          <w:sz w:val="22"/>
-          <w:szCs w:val="22"/>
-          <w:lang w:val="de-CH"/>
-        </w:rPr>
-      </w:pPr>
-      <w:r>
-        <w:rPr>
-          <w:rFonts w:ascii="Arial" w:hAnsi="Arial" w:cs="Arial"/>
-          <w:sz w:val="22"/>
-          <w:szCs w:val="22"/>
-          <w:lang w:val="de-CH"/>
-        </w:rPr>
-        <w:t>So unterstützen wir Sie dabei, Ihre finanziellen Ziele zu erreichen und sowohl Ihre Mitarbeitenden als auch sich selbst umfassend abzusichern.</w:t>
-      </w:r>
-    </w:p>
-    <w:p>
-      <w:pPr>
-        <w:pStyle w:val="Emfngeradresse"/>
-        <w:rPr>
-          <w:rFonts w:ascii="Arial" w:hAnsi="Arial" w:cs="Arial"/>
-          <w:sz w:val="22"/>
-          <w:szCs w:val="22"/>
-          <w:lang w:val="de-CH"/>
-        </w:rPr>
-      </w:pPr>
-      <w:r>
-        <w:rPr>
-          <w:rFonts w:ascii="Arial" w:hAnsi="Arial" w:cs="Arial"/>
-          <w:sz w:val="22"/>
-          <w:szCs w:val="22"/>
-          <w:lang w:val="de-CH"/>
-        </w:rPr>
-        <w:br/>
-        <w:t>Gerne würden wir Ihnen in einem persönlichen Gespräch mehr über unsere </w:t>
-      </w:r>
-    </w:p>
-    <w:p>
-      <w:pPr>
-        <w:pStyle w:val="Emfngeradresse"/>
-        <w:rPr>
-          <w:rFonts w:ascii="Arial" w:hAnsi="Arial" w:cs="Arial"/>
-          <w:sz w:val="22"/>
-          <w:szCs w:val="22"/>
-          <w:lang w:val="de-CH"/>
-        </w:rPr>
-      </w:pPr>
-      <w:r>
-        <w:rPr>
-          <w:rFonts w:ascii="Arial" w:hAnsi="Arial" w:cs="Arial"/>
-          <w:sz w:val="22"/>
-          <w:szCs w:val="22"/>
-          <w:lang w:val="de-CH"/>
-        </w:rPr>
-        <w:t>Dienstleistungen erzählen und herausfinden, wie wir Sie bestmöglich </w:t>
-      </w:r>
-    </w:p>
-    <w:p>
-      <w:pPr>
-        <w:pStyle w:val="Emfngeradresse"/>
-        <w:rPr>
-          <w:rFonts w:ascii="Arial" w:hAnsi="Arial" w:cs="Arial"/>
-          <w:sz w:val="22"/>
-          <w:szCs w:val="22"/>
-          <w:lang w:val="de-CH"/>
-        </w:rPr>
-      </w:pPr>
-      <w:r>
-        <w:rPr>
-          <w:rFonts w:ascii="Arial" w:hAnsi="Arial" w:cs="Arial"/>
-          <w:sz w:val="22"/>
-          <w:szCs w:val="22"/>
-          <w:lang w:val="de-CH"/>
-        </w:rPr>
-        <w:t>unterstützen können.</w:t>
-      </w:r>
-    </w:p>
-    <w:p>
-      <w:pPr>
-        <w:pStyle w:val="Emfngeradresse"/>
-        <w:rPr>
-          <w:rFonts w:ascii="Arial" w:hAnsi="Arial" w:cs="Arial"/>
-          <w:sz w:val="22"/>
-          <w:szCs w:val="22"/>
-          <w:lang w:val="de-CH"/>
-        </w:rPr>
-      </w:pPr>
-    </w:p>
-    <w:p>
-      <w:pPr>
-        <w:pStyle w:val="Emfngeradresse"/>
-        <w:rPr>
-          <w:rFonts w:ascii="Arial" w:hAnsi="Arial" w:cs="Arial"/>
-          <w:sz w:val="22"/>
-          <w:szCs w:val="22"/>
-          <w:lang w:val="de-CH"/>
-        </w:rPr>
-      </w:pPr>
-      <w:r>
-        <w:rPr>
-          <w:rFonts w:ascii="Arial" w:hAnsi="Arial" w:cs="Arial"/>
+      </w:pPr>
+      <w:r>
+        <w:rPr>
+          <w:b w:val="0"/>
+          <w:i w:val="0"/>
+        </w:rPr>
+        <w:t>Herzlichen Glückwunsch zur Gründung Ihrer Firma! Mit dem Handelsregistereintrag starten Sie Ihr Unternehmen – und gleichzeitig beginnen gesetzliche Versicherungspflichten, die Sie als Arbeitgeber einhalten müssen.</w:t>
+      </w:r>
+    </w:p>
+    <w:p>
+      <w:pPr>
+        <w:pStyle w:val="Emfngeradresse"/>
+      </w:pPr>
+    </w:p>
+    <w:p>
+      <w:pPr>
+        <w:pStyle w:val="Emfngeradresse"/>
+      </w:pPr>
+      <w:r>
+        <w:rPr>
           <w:b/>
-          <w:bCs/>
-          <w:sz w:val="22"/>
-          <w:szCs w:val="22"/>
-          <w:lang w:val="de-CH"/>
-        </w:rPr>
-        <w:t>Übrigens:</w:t>
-      </w:r>
-      <w:r>
-        <w:rPr>
-          <w:rFonts w:ascii="Arial" w:hAnsi="Arial" w:cs="Arial"/>
-          <w:sz w:val="22"/>
-          <w:szCs w:val="22"/>
-          <w:lang w:val="de-CH"/>
-        </w:rPr>
-        <w:t xml:space="preserve"> Auf unserer Website können Sie Ihre Firmenversicherungen bequem und unkompliziert direkt online anfragen – und Ihren Vertrag anschliessend digital unterzeichnen</w:t>
-      </w:r>
-      <w:r>
-        <w:rPr>
-          <w:rFonts w:ascii="Arial" w:hAnsi="Arial" w:cs="Arial"/>
-          <w:sz w:val="22"/>
-          <w:szCs w:val="22"/>
-          <w:lang w:val="de-CH"/>
-        </w:rPr>
-        <w:t>.</w:t>
-      </w:r>
-    </w:p>
-    <w:p>
-      <w:pPr>
-        <w:pStyle w:val="Emfngeradresse"/>
-        <w:rPr>
-          <w:rFonts w:ascii="Arial" w:hAnsi="Arial" w:cs="Arial"/>
-          <w:sz w:val="22"/>
-          <w:szCs w:val="22"/>
-          <w:lang w:val="de-CH"/>
-        </w:rPr>
-      </w:pPr>
-    </w:p>
-    <w:p>
-      <w:pPr>
-        <w:pStyle w:val="Emfngeradresse"/>
-        <w:rPr>
-          <w:rFonts w:ascii="Arial" w:hAnsi="Arial" w:cs="Arial"/>
-          <w:sz w:val="22"/>
-          <w:szCs w:val="22"/>
-          <w:lang w:val="de-CH"/>
-        </w:rPr>
-      </w:pPr>
-      <w:r>
-        <w:rPr>
-          <w:rFonts w:ascii="Arial" w:hAnsi="Arial" w:cs="Arial"/>
+          <w:i w:val="0"/>
+        </w:rPr>
+        <w:t>Was für Ihre Firma jetzt gesetzlich gilt:</w:t>
+      </w:r>
+    </w:p>
+    <w:p>
+      <w:pPr>
+        <w:pStyle w:val="Emfngeradresse"/>
+      </w:pPr>
+    </w:p>
+    <w:p>
+      <w:pPr>
+        <w:pStyle w:val="Emfngeradresse"/>
+      </w:pPr>
+      <w:r>
+        <w:t>▪  UVG – Unfallversicherung: obligatorisch ab dem ersten Mitarbeitenden</w:t>
+      </w:r>
+    </w:p>
+    <w:p>
+      <w:pPr>
+        <w:pStyle w:val="Emfngeradresse"/>
+      </w:pPr>
+      <w:r>
+        <w:t>▪  BVG / Pensionskasse – obligatorisch ab CHF 22 050 Jahreslohn</w:t>
+      </w:r>
+    </w:p>
+    <w:p>
+      <w:pPr>
+        <w:pStyle w:val="Emfngeradresse"/>
+      </w:pPr>
+      <w:r>
+        <w:t>▪  KTG – Krankentaggeld: schützt Ihren Betrieb bei Lohnfortzahlung</w:t>
+      </w:r>
+    </w:p>
+    <w:p>
+      <w:pPr>
+        <w:pStyle w:val="Emfngeradresse"/>
+      </w:pPr>
+      <w:r>
+        <w:t>▪  Berufshaftpflicht &amp; Rechtsschutz – für Ihre unternehmerische Sicherheit</w:t>
+      </w:r>
+    </w:p>
+    <w:p>
+      <w:pPr>
+        <w:pStyle w:val="Emfngeradresse"/>
+      </w:pPr>
+    </w:p>
+    <w:p>
+      <w:pPr>
+        <w:pStyle w:val="Emfngeradresse"/>
+      </w:pPr>
+      <w:r>
+        <w:rPr>
+          <w:b w:val="0"/>
+          <w:i w:val="0"/>
+        </w:rPr>
+        <w:t>Wir sind unabhängig von allen Versicherern – das bedeutet: Wir vergleichen für Sie den Markt und empfehlen nur, was wirklich zu Ihrem Unternehmen passt.</w:t>
+      </w:r>
+    </w:p>
+    <w:p>
+      <w:pPr>
+        <w:pStyle w:val="Emfngeradresse"/>
+      </w:pPr>
+    </w:p>
+    <w:p>
+      <w:pPr>
+        <w:pStyle w:val="Emfngeradresse"/>
+      </w:pPr>
+      <w:r>
+        <w:rPr>
           <w:b/>
-          <w:bCs/>
-          <w:sz w:val="22"/>
-          <w:szCs w:val="22"/>
-          <w:lang w:val="de-CH"/>
-        </w:rPr>
-        <w:t>E</w:t>
-      </w:r>
-      <w:r>
-        <w:rPr>
-          <w:rFonts w:ascii="Arial" w:hAnsi="Arial" w:cs="Arial"/>
+          <w:i w:val="0"/>
+        </w:rPr>
+        <w:t>100 % online – ohne Termin, ohne Papierkram:</w:t>
+      </w:r>
+    </w:p>
+    <w:p>
+      <w:pPr>
+        <w:pStyle w:val="Emfngeradresse"/>
+      </w:pPr>
+    </w:p>
+    <w:p>
+      <w:pPr>
+        <w:pStyle w:val="Emfngeradresse"/>
+      </w:pPr>
+      <w:r>
+        <w:rPr>
+          <w:b w:val="0"/>
+          <w:i w:val="0"/>
+        </w:rPr>
+        <w:t xml:space="preserve">Besuchen Sie uns auf </w:t>
+      </w:r>
+      <w:r>
+        <w:rPr>
           <w:b/>
-          <w:bCs/>
-          <w:sz w:val="22"/>
-          <w:szCs w:val="22"/>
-          <w:lang w:val="de-CH"/>
-        </w:rPr>
-        <w:t>-M</w:t>
-      </w:r>
-      <w:r>
-        <w:rPr>
-          <w:rFonts w:ascii="Arial" w:hAnsi="Arial" w:cs="Arial"/>
+          <w:i w:val="0"/>
+        </w:rPr>
+        <w:t>www.confidio.ch</w:t>
+      </w:r>
+      <w:r>
+        <w:rPr>
+          <w:b w:val="0"/>
+          <w:i w:val="0"/>
+        </w:rPr>
+        <w:t>, füllen Sie unsere Offertanfrage in wenigen Minuten aus und erhalten Sie ein massgeschneidertes Angebot. Den Vertrag unterzeichnen Sie anschliessend bequem digital.</w:t>
+      </w:r>
+    </w:p>
+    <w:p>
+      <w:pPr>
+        <w:pStyle w:val="Emfngeradresse"/>
+      </w:pPr>
+    </w:p>
+    <w:p>
+      <w:pPr>
+        <w:pStyle w:val="Emfngeradresse"/>
+      </w:pPr>
+      <w:r>
+        <w:rPr>
+          <w:b w:val="0"/>
+          <w:i w:val="0"/>
+        </w:rPr>
+        <w:t>Wir freuen uns, Sie auf Ihrem unternehmerischen Weg zu begleiten.</w:t>
+      </w:r>
+    </w:p>
+    <w:p>
+      <w:pPr>
+        <w:pStyle w:val="Emfngeradresse"/>
+      </w:pPr>
+    </w:p>
+    <w:p>
+      <w:pPr>
+        <w:pStyle w:val="Emfngeradresse"/>
+      </w:pPr>
+      <w:r>
+        <w:rPr>
+          <w:b w:val="0"/>
+          <w:i w:val="0"/>
+        </w:rPr>
+        <w:t>Freundliche Grüsse</w:t>
+      </w:r>
+    </w:p>
+    <w:p>
+      <w:pPr>
+        <w:pStyle w:val="Emfngeradresse"/>
+      </w:pPr>
+      <w:r>
+        <w:rPr>
+          <w:b w:val="0"/>
+          <w:i w:val="0"/>
+        </w:rPr>
+        <w:t>Ihr Confidio Team</w:t>
+      </w:r>
+    </w:p>
+    <w:p>
+      <w:pPr>
+        <w:pStyle w:val="Emfngeradresse"/>
+      </w:pPr>
+    </w:p>
+    <w:p>
+      <w:pPr>
+        <w:pStyle w:val="Emfngeradresse"/>
+      </w:pPr>
+      <w:r>
+        <w:rPr>
+          <w:b w:val="0"/>
+          <w:i w:val="0"/>
+        </w:rPr>
+        <w:t xml:space="preserve">info@confidio.ch  |  </w:t>
+      </w:r>
+      <w:r>
+        <w:rPr>
           <w:b/>
-          <w:bCs/>
-          <w:sz w:val="22"/>
-          <w:szCs w:val="22"/>
-          <w:lang w:val="de-CH"/>
-        </w:rPr>
-        <w:t>ail:</w:t>
-      </w:r>
-      <w:r>
-        <w:rPr>
-          <w:rFonts w:ascii="Arial" w:hAnsi="Arial" w:cs="Arial"/>
-          <w:b/>
-          <w:bCs/>
-          <w:sz w:val="22"/>
-          <w:szCs w:val="22"/>
-          <w:lang w:val="de-CH"/>
-        </w:rPr>
-        <w:t xml:space="preserve"> info@confidio.ch                        Website: https://www.confidio.ch/</w:t>
-      </w:r>
-      <w:r>
-        <w:rPr>
-          <w:rFonts w:ascii="Arial" w:hAnsi="Arial" w:cs="Arial"/>
-          <w:b/>
-          <w:bCs/>
-          <w:sz w:val="22"/>
-          <w:szCs w:val="22"/>
-          <w:lang w:val="de-CH"/>
-        </w:rPr>
-        <w:br/>
-      </w:r>
-      <w:r>
-        <w:rPr>
-          <w:rFonts w:ascii="Arial" w:hAnsi="Arial" w:cs="Arial"/>
-          <w:sz w:val="22"/>
-          <w:szCs w:val="22"/>
-          <w:lang w:val="de-CH"/>
-        </w:rPr>
-        <w:br/>
-        <w:t>Wir freuen uns darauf, Sie kennenzulernen und gemeinsam an Ihrem Erfolg </w:t>
-      </w:r>
-    </w:p>
-    <w:p>
-      <w:pPr>
-        <w:pStyle w:val="Emfngeradresse"/>
-        <w:rPr>
-          <w:rFonts w:ascii="Arial" w:hAnsi="Arial" w:cs="Arial"/>
-          <w:sz w:val="22"/>
-          <w:szCs w:val="22"/>
-          <w:lang w:val="de-CH"/>
-        </w:rPr>
-      </w:pPr>
-      <w:r>
-        <w:rPr>
-          <w:rFonts w:ascii="Arial" w:hAnsi="Arial" w:cs="Arial"/>
-          <w:sz w:val="22"/>
-          <w:szCs w:val="22"/>
-          <w:lang w:val="de-CH"/>
-        </w:rPr>
-        <w:t>zu arbeiten!</w:t>
-      </w:r>
-    </w:p>
-    <w:p>
-      <w:pPr>
-        <w:pStyle w:val="Emfngeradresse"/>
-        <w:rPr>
-          <w:rFonts w:ascii="Arial" w:hAnsi="Arial" w:cs="Arial"/>
-          <w:sz w:val="22"/>
-          <w:szCs w:val="22"/>
-          <w:lang w:val="de-CH"/>
-        </w:rPr>
-      </w:pPr>
-      <w:r>
-        <w:rPr>
-          <w:rFonts w:ascii="Arial" w:hAnsi="Arial" w:cs="Arial"/>
-          <w:sz w:val="22"/>
-          <w:szCs w:val="22"/>
-          <w:lang w:val="de-CH"/>
-        </w:rPr>
-        <w:br/>
-      </w:r>
-      <w:r>
-        <w:rPr>
-          <w:rFonts w:ascii="Arial" w:hAnsi="Arial" w:cs="Arial"/>
-          <w:sz w:val="22"/>
-          <w:szCs w:val="22"/>
-          <w:lang w:val="de-CH"/>
-        </w:rPr>
-        <w:t>Freundliche Grüsse</w:t>
-      </w:r>
-    </w:p>
-    <w:p>
-      <w:pPr>
-        <w:pStyle w:val="Emfngeradresse"/>
-        <w:rPr>
-          <w:rFonts w:ascii="Arial" w:hAnsi="Arial" w:cs="Arial"/>
-          <w:sz w:val="22"/>
-          <w:szCs w:val="22"/>
-        </w:rPr>
-      </w:pPr>
-      <w:r>
-        <w:rPr>
-          <w:noProof/>
-        </w:rPr>
-        <w:drawing>
-          <wp:anchor distT="0" distB="0" distL="114300" distR="114300" simplePos="0" relativeHeight="251666432" behindDoc="0" locked="0" layoutInCell="1" allowOverlap="1" wp14:anchorId="7A7F90FE" wp14:editId="5445A82B">
-            <wp:simplePos x="0" y="0"/>
-            <wp:positionH relativeFrom="margin">
-              <wp:posOffset>4112741</wp:posOffset>
-            </wp:positionH>
-            <wp:positionV relativeFrom="paragraph">
-              <wp:posOffset>778270</wp:posOffset>
-            </wp:positionV>
-            <wp:extent cx="1357630" cy="471819"/>
-            <wp:effectExtent l="0" t="0" r="0" b="4445"/>
-            <wp:wrapNone/>
-            <wp:docPr id="1660236486" name="Grafik 1" descr="Axa logo and symbol, meaning, history, PNG, brand"/>
-            <wp:cNvGraphicFramePr>
-              <a:graphicFrameLocks xmlns:a="http://schemas.openxmlformats.org/drawingml/2006/main" noChangeAspect="1"/>
-            </wp:cNvGraphicFramePr>
-            <a:graphic xmlns:a="http://schemas.openxmlformats.org/drawingml/2006/main">
-              <a:graphicData uri="http://schemas.openxmlformats.org/drawingml/2006/picture">
-                <pic:pic xmlns:pic="http://schemas.openxmlformats.org/drawingml/2006/picture">
-                  <pic:nvPicPr>
-                    <pic:cNvPr id="0" name="Picture 1" descr="Axa logo and symbol, meaning, history, PNG, brand"/>
-                    <pic:cNvPicPr>
-                      <a:picLocks noChangeAspect="1" noChangeArrowheads="1"/>
-                    </pic:cNvPicPr>
-                  </pic:nvPicPr>
-                  <pic:blipFill rotWithShape="1">
-                    <a:blip r:embed="rId11" cstate="print">
-                      <a:extLst>
-                        <a:ext uri="{28A0092B-C50C-407E-A947-70E740481C1C}">
-                          <a14:useLocalDpi xmlns:a14="http://schemas.microsoft.com/office/drawing/2010/main" val="0"/>
-                        </a:ext>
-                      </a:extLst>
-                    </a:blip>
-                    <a:srcRect t="26486" b="11748"/>
-                    <a:stretch>
-                      <a:fillRect/>
-                    </a:stretch>
-                  </pic:blipFill>
-                  <pic:spPr bwMode="auto">
-                    <a:xfrm>
-                      <a:off x="0" y="0"/>
-                      <a:ext cx="1369335" cy="475887"/>
-                    </a:xfrm>
-                    <a:prstGeom prst="rect">
-                      <a:avLst/>
-                    </a:prstGeom>
-                    <a:noFill/>
-                    <a:ln>
-                      <a:noFill/>
-                    </a:ln>
-                    <a:extLst>
-                      <a:ext uri="{53640926-AAD7-44D8-BBD7-CCE9431645EC}">
-                        <a14:shadowObscured xmlns:a14="http://schemas.microsoft.com/office/drawing/2010/main"/>
-                      </a:ext>
-                    </a:extLst>
-                  </pic:spPr>
-                </pic:pic>
-              </a:graphicData>
-            </a:graphic>
-            <wp14:sizeRelH relativeFrom="margin">
-              <wp14:pctWidth>0</wp14:pctWidth>
-            </wp14:sizeRelH>
-            <wp14:sizeRelV relativeFrom="margin">
-              <wp14:pctHeight>0</wp14:pctHeight>
-            </wp14:sizeRelV>
-          </wp:anchor>
-        </w:drawing>
-      </w:r>
-      <w:r>
-        <w:rPr>
-          <w:noProof/>
-          <w:sz w:val="22"/>
-          <w:szCs w:val="22"/>
-        </w:rPr>
-        <w:drawing>
-          <wp:anchor distT="0" distB="0" distL="114300" distR="114300" simplePos="0" relativeHeight="251665408" behindDoc="1" locked="0" layoutInCell="1" allowOverlap="1" wp14:anchorId="243B0D16" wp14:editId="11B9038E">
-            <wp:simplePos x="0" y="0"/>
-            <wp:positionH relativeFrom="margin">
-              <wp:posOffset>3268397</wp:posOffset>
-            </wp:positionH>
-            <wp:positionV relativeFrom="paragraph">
-              <wp:posOffset>954988</wp:posOffset>
-            </wp:positionV>
-            <wp:extent cx="689751" cy="293511"/>
-            <wp:effectExtent l="0" t="0" r="0" b="0"/>
-            <wp:wrapNone/>
-            <wp:docPr id="17" name="Bild 17"/>
-            <wp:cNvGraphicFramePr>
-              <a:graphicFrameLocks xmlns:a="http://schemas.openxmlformats.org/drawingml/2006/main" noChangeAspect="1"/>
-            </wp:cNvGraphicFramePr>
-            <a:graphic xmlns:a="http://schemas.openxmlformats.org/drawingml/2006/main">
-              <a:graphicData uri="http://schemas.openxmlformats.org/drawingml/2006/picture">
-                <pic:pic xmlns:pic="http://schemas.openxmlformats.org/drawingml/2006/picture">
-                  <pic:nvPicPr>
-                    <pic:cNvPr id="17" name="Bild 17"/>
-                    <pic:cNvPicPr>
-                      <a:picLocks noChangeAspect="1" noChangeArrowheads="1"/>
-                    </pic:cNvPicPr>
-                  </pic:nvPicPr>
-                  <pic:blipFill>
-                    <a:blip r:embed="rId12" cstate="print">
-                      <a:extLst>
-                        <a:ext uri="{28A0092B-C50C-407E-A947-70E740481C1C}">
-                          <a14:useLocalDpi xmlns:a14="http://schemas.microsoft.com/office/drawing/2010/main" val="0"/>
-                        </a:ext>
-                      </a:extLst>
-                    </a:blip>
-                    <a:stretch>
-                      <a:fillRect/>
-                    </a:stretch>
-                  </pic:blipFill>
-                  <pic:spPr bwMode="auto">
-                    <a:xfrm>
-                      <a:off x="0" y="0"/>
-                      <a:ext cx="689751" cy="293511"/>
-                    </a:xfrm>
-                    <a:prstGeom prst="rect">
-                      <a:avLst/>
-                    </a:prstGeom>
-                    <a:noFill/>
-                    <a:ln>
-                      <a:noFill/>
-                    </a:ln>
-                  </pic:spPr>
-                </pic:pic>
-              </a:graphicData>
-            </a:graphic>
-            <wp14:sizeRelH relativeFrom="margin">
-              <wp14:pctWidth>0</wp14:pctWidth>
-            </wp14:sizeRelH>
-            <wp14:sizeRelV relativeFrom="margin">
-              <wp14:pctHeight>0</wp14:pctHeight>
-            </wp14:sizeRelV>
-          </wp:anchor>
-        </w:drawing>
-      </w:r>
-      <w:r>
-        <w:rPr>
-          <w:noProof/>
-          <w:sz w:val="22"/>
-          <w:szCs w:val="22"/>
-        </w:rPr>
-        <w:drawing>
-          <wp:anchor distT="0" distB="0" distL="114300" distR="114300" simplePos="0" relativeHeight="251664384" behindDoc="1" locked="0" layoutInCell="1" allowOverlap="1" wp14:anchorId="24029FC9" wp14:editId="64E05CF7">
-            <wp:simplePos x="0" y="0"/>
-            <wp:positionH relativeFrom="margin">
-              <wp:posOffset>1744396</wp:posOffset>
-            </wp:positionH>
-            <wp:positionV relativeFrom="paragraph">
-              <wp:posOffset>994359</wp:posOffset>
-            </wp:positionV>
-            <wp:extent cx="1207911" cy="243094"/>
-            <wp:effectExtent l="0" t="0" r="0" b="0"/>
-            <wp:wrapNone/>
-            <wp:docPr id="15" name="Bild 15"/>
-            <wp:cNvGraphicFramePr>
-              <a:graphicFrameLocks xmlns:a="http://schemas.openxmlformats.org/drawingml/2006/main" noChangeAspect="1"/>
-            </wp:cNvGraphicFramePr>
-            <a:graphic xmlns:a="http://schemas.openxmlformats.org/drawingml/2006/main">
-              <a:graphicData uri="http://schemas.openxmlformats.org/drawingml/2006/picture">
-                <pic:pic xmlns:pic="http://schemas.openxmlformats.org/drawingml/2006/picture">
-                  <pic:nvPicPr>
-                    <pic:cNvPr id="15" name="Bild 15"/>
-                    <pic:cNvPicPr>
-                      <a:picLocks noChangeAspect="1" noChangeArrowheads="1"/>
-                    </pic:cNvPicPr>
-                  </pic:nvPicPr>
-                  <pic:blipFill>
-                    <a:blip r:embed="rId13" cstate="print">
-                      <a:extLst>
-                        <a:ext uri="{28A0092B-C50C-407E-A947-70E740481C1C}">
-                          <a14:useLocalDpi xmlns:a14="http://schemas.microsoft.com/office/drawing/2010/main" val="0"/>
-                        </a:ext>
-                      </a:extLst>
-                    </a:blip>
-                    <a:stretch>
-                      <a:fillRect/>
-                    </a:stretch>
-                  </pic:blipFill>
-                  <pic:spPr bwMode="auto">
-                    <a:xfrm>
-                      <a:off x="0" y="0"/>
-                      <a:ext cx="1207911" cy="243094"/>
-                    </a:xfrm>
-                    <a:prstGeom prst="rect">
-                      <a:avLst/>
-                    </a:prstGeom>
-                    <a:noFill/>
-                    <a:ln>
-                      <a:noFill/>
-                    </a:ln>
-                  </pic:spPr>
-                </pic:pic>
-              </a:graphicData>
-            </a:graphic>
-            <wp14:sizeRelH relativeFrom="margin">
-              <wp14:pctWidth>0</wp14:pctWidth>
-            </wp14:sizeRelH>
-            <wp14:sizeRelV relativeFrom="margin">
-              <wp14:pctHeight>0</wp14:pctHeight>
-            </wp14:sizeRelV>
-          </wp:anchor>
-        </w:drawing>
-      </w:r>
-      <w:r>
-        <w:rPr>
-          <w:noProof/>
-          <w:sz w:val="22"/>
-          <w:szCs w:val="22"/>
-        </w:rPr>
-        <w:drawing>
-          <wp:anchor distT="0" distB="0" distL="114300" distR="114300" simplePos="0" relativeHeight="251661312" behindDoc="1" locked="0" layoutInCell="1" allowOverlap="1" wp14:anchorId="58DCB06F" wp14:editId="19D81562">
-            <wp:simplePos x="0" y="0"/>
-            <wp:positionH relativeFrom="margin">
-              <wp:posOffset>416955</wp:posOffset>
-            </wp:positionH>
-            <wp:positionV relativeFrom="paragraph">
-              <wp:posOffset>940367</wp:posOffset>
-            </wp:positionV>
-            <wp:extent cx="909947" cy="304942"/>
-            <wp:effectExtent l="0" t="0" r="5080" b="0"/>
-            <wp:wrapNone/>
-            <wp:docPr id="10" name="Bild 10"/>
-            <wp:cNvGraphicFramePr>
-              <a:graphicFrameLocks xmlns:a="http://schemas.openxmlformats.org/drawingml/2006/main" noChangeAspect="1"/>
-            </wp:cNvGraphicFramePr>
-            <a:graphic xmlns:a="http://schemas.openxmlformats.org/drawingml/2006/main">
-              <a:graphicData uri="http://schemas.openxmlformats.org/drawingml/2006/picture">
-                <pic:pic xmlns:pic="http://schemas.openxmlformats.org/drawingml/2006/picture">
-                  <pic:nvPicPr>
-                    <pic:cNvPr id="10" name="Bild 10"/>
-                    <pic:cNvPicPr>
-                      <a:picLocks noChangeAspect="1" noChangeArrowheads="1"/>
-                    </pic:cNvPicPr>
-                  </pic:nvPicPr>
-                  <pic:blipFill>
-                    <a:blip r:embed="rId14" cstate="print">
-                      <a:extLst>
-                        <a:ext uri="{28A0092B-C50C-407E-A947-70E740481C1C}">
-                          <a14:useLocalDpi xmlns:a14="http://schemas.microsoft.com/office/drawing/2010/main" val="0"/>
-                        </a:ext>
-                      </a:extLst>
-                    </a:blip>
-                    <a:stretch>
-                      <a:fillRect/>
-                    </a:stretch>
-                  </pic:blipFill>
-                  <pic:spPr bwMode="auto">
-                    <a:xfrm>
-                      <a:off x="0" y="0"/>
-                      <a:ext cx="909947" cy="304942"/>
-                    </a:xfrm>
-                    <a:prstGeom prst="rect">
-                      <a:avLst/>
-                    </a:prstGeom>
-                    <a:noFill/>
-                    <a:ln>
-                      <a:noFill/>
-                    </a:ln>
-                  </pic:spPr>
-                </pic:pic>
-              </a:graphicData>
-            </a:graphic>
-            <wp14:sizeRelH relativeFrom="margin">
-              <wp14:pctWidth>0</wp14:pctWidth>
-            </wp14:sizeRelH>
-            <wp14:sizeRelV relativeFrom="margin">
-              <wp14:pctHeight>0</wp14:pctHeight>
-            </wp14:sizeRelV>
-          </wp:anchor>
-        </w:drawing>
-      </w:r>
-      <w:r>
-        <w:rPr>
-          <w:noProof/>
-          <w:sz w:val="22"/>
-          <w:szCs w:val="22"/>
-        </w:rPr>
-        <w:drawing>
-          <wp:anchor distT="0" distB="0" distL="114300" distR="114300" simplePos="0" relativeHeight="251662336" behindDoc="1" locked="0" layoutInCell="1" allowOverlap="1" wp14:anchorId="399B35B4" wp14:editId="5ADDE885">
-            <wp:simplePos x="0" y="0"/>
-            <wp:positionH relativeFrom="margin">
-              <wp:posOffset>2841695</wp:posOffset>
-            </wp:positionH>
-            <wp:positionV relativeFrom="paragraph">
-              <wp:posOffset>323215</wp:posOffset>
-            </wp:positionV>
-            <wp:extent cx="1223285" cy="416681"/>
-            <wp:effectExtent l="0" t="0" r="0" b="2540"/>
-            <wp:wrapNone/>
-            <wp:docPr id="12" name="Bild 12"/>
-            <wp:cNvGraphicFramePr>
-              <a:graphicFrameLocks xmlns:a="http://schemas.openxmlformats.org/drawingml/2006/main" noChangeAspect="1"/>
-            </wp:cNvGraphicFramePr>
-            <a:graphic xmlns:a="http://schemas.openxmlformats.org/drawingml/2006/main">
-              <a:graphicData uri="http://schemas.openxmlformats.org/drawingml/2006/picture">
-                <pic:pic xmlns:pic="http://schemas.openxmlformats.org/drawingml/2006/picture">
-                  <pic:nvPicPr>
-                    <pic:cNvPr id="12" name="Bild 12"/>
-                    <pic:cNvPicPr>
-                      <a:picLocks noChangeAspect="1" noChangeArrowheads="1"/>
-                    </pic:cNvPicPr>
-                  </pic:nvPicPr>
-                  <pic:blipFill>
-                    <a:blip r:embed="rId15" cstate="print">
-                      <a:extLst>
-                        <a:ext uri="{28A0092B-C50C-407E-A947-70E740481C1C}">
-                          <a14:useLocalDpi xmlns:a14="http://schemas.microsoft.com/office/drawing/2010/main" val="0"/>
-                        </a:ext>
-                      </a:extLst>
-                    </a:blip>
-                    <a:stretch>
-                      <a:fillRect/>
-                    </a:stretch>
-                  </pic:blipFill>
-                  <pic:spPr bwMode="auto">
-                    <a:xfrm>
-                      <a:off x="0" y="0"/>
-                      <a:ext cx="1223285" cy="416681"/>
-                    </a:xfrm>
-                    <a:prstGeom prst="rect">
-                      <a:avLst/>
-                    </a:prstGeom>
-                    <a:noFill/>
-                    <a:ln>
-                      <a:noFill/>
-                    </a:ln>
-                  </pic:spPr>
-                </pic:pic>
-              </a:graphicData>
-            </a:graphic>
-            <wp14:sizeRelH relativeFrom="margin">
-              <wp14:pctWidth>0</wp14:pctWidth>
-            </wp14:sizeRelH>
-            <wp14:sizeRelV relativeFrom="margin">
-              <wp14:pctHeight>0</wp14:pctHeight>
-            </wp14:sizeRelV>
-          </wp:anchor>
-        </w:drawing>
-      </w:r>
-      <w:r>
-        <w:rPr>
-          <w:noProof/>
-          <w:sz w:val="22"/>
-          <w:szCs w:val="22"/>
-        </w:rPr>
-        <w:drawing>
-          <wp:anchor distT="0" distB="0" distL="114300" distR="114300" simplePos="0" relativeHeight="251663360" behindDoc="1" locked="0" layoutInCell="1" allowOverlap="1" wp14:anchorId="6B7AF49F" wp14:editId="7A76805C">
-            <wp:simplePos x="0" y="0"/>
-            <wp:positionH relativeFrom="margin">
-              <wp:posOffset>944880</wp:posOffset>
-            </wp:positionH>
-            <wp:positionV relativeFrom="paragraph">
-              <wp:posOffset>264160</wp:posOffset>
-            </wp:positionV>
-            <wp:extent cx="1595755" cy="530225"/>
-            <wp:effectExtent l="0" t="0" r="4445" b="3175"/>
-            <wp:wrapNone/>
-            <wp:docPr id="14" name="Bild 14"/>
-            <wp:cNvGraphicFramePr>
-              <a:graphicFrameLocks xmlns:a="http://schemas.openxmlformats.org/drawingml/2006/main" noChangeAspect="1"/>
-            </wp:cNvGraphicFramePr>
-            <a:graphic xmlns:a="http://schemas.openxmlformats.org/drawingml/2006/main">
-              <a:graphicData uri="http://schemas.openxmlformats.org/drawingml/2006/picture">
-                <pic:pic xmlns:pic="http://schemas.openxmlformats.org/drawingml/2006/picture">
-                  <pic:nvPicPr>
-                    <pic:cNvPr id="14" name="Bild 14"/>
-                    <pic:cNvPicPr>
-                      <a:picLocks noChangeAspect="1" noChangeArrowheads="1"/>
-                    </pic:cNvPicPr>
-                  </pic:nvPicPr>
-                  <pic:blipFill rotWithShape="1">
-                    <a:blip r:embed="rId16" cstate="print">
-                      <a:extLst>
-                        <a:ext uri="{28A0092B-C50C-407E-A947-70E740481C1C}">
-                          <a14:useLocalDpi xmlns:a14="http://schemas.microsoft.com/office/drawing/2010/main" val="0"/>
-                        </a:ext>
-                      </a:extLst>
-                    </a:blip>
-                    <a:srcRect t="31833" b="34941"/>
-                    <a:stretch/>
-                  </pic:blipFill>
-                  <pic:spPr bwMode="auto">
-                    <a:xfrm>
-                      <a:off x="0" y="0"/>
-                      <a:ext cx="1595755" cy="530225"/>
-                    </a:xfrm>
-                    <a:prstGeom prst="rect">
-                      <a:avLst/>
-                    </a:prstGeom>
-                    <a:noFill/>
-                    <a:ln>
-                      <a:noFill/>
-                    </a:ln>
-                    <a:extLst>
-                      <a:ext uri="{53640926-AAD7-44D8-BBD7-CCE9431645EC}">
-                        <a14:shadowObscured xmlns:a14="http://schemas.microsoft.com/office/drawing/2010/main"/>
-                      </a:ext>
-                    </a:extLst>
-                  </pic:spPr>
-                </pic:pic>
-              </a:graphicData>
-            </a:graphic>
-            <wp14:sizeRelH relativeFrom="margin">
-              <wp14:pctWidth>0</wp14:pctWidth>
-            </wp14:sizeRelH>
-            <wp14:sizeRelV relativeFrom="margin">
-              <wp14:pctHeight>0</wp14:pctHeight>
-            </wp14:sizeRelV>
-          </wp:anchor>
-        </w:drawing>
-      </w:r>
-      <w:r>
-        <w:rPr>
-          <w:rFonts w:ascii="Arial" w:hAnsi="Arial" w:cs="Arial"/>
-          <w:noProof/>
-          <w:sz w:val="22"/>
-          <w:szCs w:val="22"/>
-          <w:lang w:val="de-CH"/>
-        </w:rPr>
-        <w:drawing>
-          <wp:anchor distT="0" distB="0" distL="114300" distR="114300" simplePos="0" relativeHeight="251659264" behindDoc="1" locked="0" layoutInCell="1" allowOverlap="1" wp14:anchorId="1A6AD88D" wp14:editId="6892247C">
-            <wp:simplePos x="0" y="0"/>
-            <wp:positionH relativeFrom="margin">
-              <wp:posOffset>-386433</wp:posOffset>
-            </wp:positionH>
-            <wp:positionV relativeFrom="paragraph">
-              <wp:posOffset>263736</wp:posOffset>
-            </wp:positionV>
-            <wp:extent cx="925689" cy="644384"/>
-            <wp:effectExtent l="0" t="0" r="1905" b="3810"/>
-            <wp:wrapNone/>
-            <wp:docPr id="1944560991" name="Grafik 1"/>
-            <wp:cNvGraphicFramePr>
-              <a:graphicFrameLocks xmlns:a="http://schemas.openxmlformats.org/drawingml/2006/main" noChangeAspect="1"/>
-            </wp:cNvGraphicFramePr>
-            <a:graphic xmlns:a="http://schemas.openxmlformats.org/drawingml/2006/main">
-              <a:graphicData uri="http://schemas.openxmlformats.org/drawingml/2006/picture">
-                <pic:pic xmlns:pic="http://schemas.openxmlformats.org/drawingml/2006/picture">
-                  <pic:nvPicPr>
-                    <pic:cNvPr id="1944560991" name="Grafik 1"/>
-                    <pic:cNvPicPr>
-                      <a:picLocks noChangeAspect="1" noChangeArrowheads="1"/>
-                    </pic:cNvPicPr>
-                  </pic:nvPicPr>
-                  <pic:blipFill>
-                    <a:blip r:embed="rId17" cstate="print">
-                      <a:extLst>
-                        <a:ext uri="{28A0092B-C50C-407E-A947-70E740481C1C}">
-                          <a14:useLocalDpi xmlns:a14="http://schemas.microsoft.com/office/drawing/2010/main" val="0"/>
-                        </a:ext>
-                      </a:extLst>
-                    </a:blip>
-                    <a:stretch>
-                      <a:fillRect/>
-                    </a:stretch>
-                  </pic:blipFill>
-                  <pic:spPr bwMode="auto">
-                    <a:xfrm>
-                      <a:off x="0" y="0"/>
-                      <a:ext cx="925689" cy="644384"/>
-                    </a:xfrm>
-                    <a:prstGeom prst="rect">
-                      <a:avLst/>
-                    </a:prstGeom>
-                    <a:noFill/>
-                  </pic:spPr>
-                </pic:pic>
-              </a:graphicData>
-            </a:graphic>
-            <wp14:sizeRelH relativeFrom="margin">
-              <wp14:pctWidth>0</wp14:pctWidth>
-            </wp14:sizeRelH>
-            <wp14:sizeRelV relativeFrom="margin">
-              <wp14:pctHeight>0</wp14:pctHeight>
-            </wp14:sizeRelV>
-          </wp:anchor>
-        </w:drawing>
-      </w:r>
-      <w:r>
-        <w:rPr>
-          <w:noProof/>
-          <w:sz w:val="22"/>
-          <w:szCs w:val="22"/>
-        </w:rPr>
-        <w:drawing>
-          <wp:anchor distT="0" distB="0" distL="114300" distR="114300" simplePos="0" relativeHeight="251660288" behindDoc="1" locked="0" layoutInCell="1" allowOverlap="1" wp14:anchorId="514F9D37" wp14:editId="5A3C15AF">
-            <wp:simplePos x="0" y="0"/>
-            <wp:positionH relativeFrom="margin">
-              <wp:posOffset>4448175</wp:posOffset>
-            </wp:positionH>
-            <wp:positionV relativeFrom="paragraph">
-              <wp:posOffset>445770</wp:posOffset>
-            </wp:positionV>
-            <wp:extent cx="1152525" cy="316944"/>
-            <wp:effectExtent l="0" t="0" r="0" b="6985"/>
-            <wp:wrapNone/>
-            <wp:docPr id="8" name="Bild 8" descr="Ein Bild, das Schrift, Text, Grafiken, Typografie enthält.&#10;&#10;Automatisch generierte Beschreibung"/>
-            <wp:cNvGraphicFramePr>
-              <a:graphicFrameLocks xmlns:a="http://schemas.openxmlformats.org/drawingml/2006/main" noChangeAspect="1"/>
-            </wp:cNvGraphicFramePr>
-            <a:graphic xmlns:a="http://schemas.openxmlformats.org/drawingml/2006/main">
-              <a:graphicData uri="http://schemas.openxmlformats.org/drawingml/2006/picture">
-                <pic:pic xmlns:pic="http://schemas.openxmlformats.org/drawingml/2006/picture">
-                  <pic:nvPicPr>
-                    <pic:cNvPr id="8" name="Bild 8" descr="Ein Bild, das Schrift, Text, Grafiken, Typografie enthält.&#10;&#10;Automatisch generierte Beschreibung"/>
-                    <pic:cNvPicPr>
-                      <a:picLocks noChangeAspect="1" noChangeArrowheads="1"/>
-                    </pic:cNvPicPr>
-                  </pic:nvPicPr>
-                  <pic:blipFill>
-                    <a:blip r:embed="rId18" cstate="print">
-                      <a:extLst>
-                        <a:ext uri="{28A0092B-C50C-407E-A947-70E740481C1C}">
-                          <a14:useLocalDpi xmlns:a14="http://schemas.microsoft.com/office/drawing/2010/main" val="0"/>
-                        </a:ext>
-                      </a:extLst>
-                    </a:blip>
-                    <a:srcRect/>
-                    <a:stretch>
-                      <a:fillRect/>
-                    </a:stretch>
-                  </pic:blipFill>
-                  <pic:spPr bwMode="auto">
-                    <a:xfrm>
-                      <a:off x="0" y="0"/>
-                      <a:ext cx="1152525" cy="316944"/>
-                    </a:xfrm>
-                    <a:prstGeom prst="rect">
-                      <a:avLst/>
-                    </a:prstGeom>
-                    <a:noFill/>
-                    <a:ln>
-                      <a:noFill/>
-                    </a:ln>
-                  </pic:spPr>
-                </pic:pic>
-              </a:graphicData>
-            </a:graphic>
-            <wp14:sizeRelH relativeFrom="margin">
-              <wp14:pctWidth>0</wp14:pctWidth>
-            </wp14:sizeRelH>
-            <wp14:sizeRelV relativeFrom="margin">
-              <wp14:pctHeight>0</wp14:pctHeight>
-            </wp14:sizeRelV>
-          </wp:anchor>
-        </w:drawing>
-      </w:r>
-      <w:r>
-        <w:rPr>
-          <w:rFonts w:ascii="Arial" w:hAnsi="Arial" w:cs="Arial"/>
-          <w:sz w:val="22"/>
-          <w:szCs w:val="22"/>
-          <w:lang w:val="de-CH"/>
-        </w:rPr>
-        <w:t xml:space="preserve">Ihr </w:t>
-      </w:r>
-      <w:proofErr w:type="spellStart"/>
-      <w:r>
-        <w:rPr>
-          <w:rFonts w:ascii="Arial" w:hAnsi="Arial" w:cs="Arial"/>
-          <w:sz w:val="22"/>
-          <w:szCs w:val="22"/>
-          <w:lang w:val="de-CH"/>
-        </w:rPr>
-        <w:t>Confidio</w:t>
-      </w:r>
-      <w:proofErr w:type="spellEnd"/>
-      <w:r>
-        <w:rPr>
-          <w:rFonts w:ascii="Arial" w:hAnsi="Arial" w:cs="Arial"/>
-          <w:sz w:val="22"/>
-          <w:szCs w:val="22"/>
-          <w:lang w:val="de-CH"/>
-        </w:rPr>
-        <w:t xml:space="preserve"> Team</w:t>
+          <w:i w:val="0"/>
+        </w:rPr>
+        <w:t>www.confidio.ch</w:t>
+      </w:r>
+    </w:p>
+    <w:p>
+      <w:pPr>
+        <w:pStyle w:val="Emfngeradresse"/>
+      </w:pPr>
+    </w:p>
+    <w:p>
+      <w:pPr>
+        <w:pStyle w:val="Emfngeradresse"/>
+      </w:pPr>
+      <w:r>
+        <w:rPr>
+          <w:b w:val="0"/>
+          <w:i/>
+        </w:rPr>
+        <w:t>Sie möchten keine weiteren Zuschriften von uns? Schreiben Sie uns an info@confidio.ch – wir entfernen Sie umgehend aus unserem Verteiler.</w:t>
       </w:r>
     </w:p>
     <w:sectPr>

</xml_diff>

<commit_message>
Fix template: restore all 8 partner logos + apply V2 text changes
- Base: original template with Confidio + 7 partner logos intact
- Text: new Betreff (Pflichtversicherungen), bullet list UVG/BVG/KTG,
  unabhaengige Beratung, www.confidio.ch CTA, opt-out footer
- No font/logo changes - text only

Co-Authored-By: Claude Sonnet 4.6 <noreply@anthropic.com>
</commit_message>
<xml_diff>
--- a/Brief an neue Firmen.docx
+++ b/Brief an neue Firmen.docx
@@ -20,7 +20,7 @@
           <w:szCs w:val="22"/>
         </w:rPr>
         <w:drawing>
-          <wp:anchor distT="0" distB="0" distL="114300" distR="114300" simplePos="0" relativeHeight="251658240" behindDoc="1" locked="0" layoutInCell="1" allowOverlap="1" wp14:anchorId="067DC30C" wp14:editId="6E556EB5">
+          <wp:anchor distT="0" distB="0" distL="114300" distR="114300" simplePos="0" relativeHeight="251658240" behindDoc="1" locked="0" layoutInCell="1" allowOverlap="1" wp14:anchorId="067DC30C" wp14:editId="1130B477">
             <wp:simplePos x="0" y="0"/>
             <wp:positionH relativeFrom="margin">
               <wp:posOffset>2693035</wp:posOffset>
@@ -81,7 +81,6 @@
           </wp:anchor>
         </w:drawing>
       </w:r>
-      <w:proofErr w:type="spellStart"/>
       <w:r>
         <w:rPr>
           <w:rFonts w:ascii="Arial" w:hAnsi="Arial" w:cs="Arial"/>
@@ -89,17 +88,27 @@
           <w:szCs w:val="22"/>
           <w:lang w:val="it-CH"/>
         </w:rPr>
-        <w:t>Confidio</w:t>
-      </w:r>
-      <w:proofErr w:type="spellEnd"/>
-      <w:r>
+        <w:t>Confidio GmbH</w:t>
+      </w:r>
+    </w:p>
+    <w:p>
+      <w:pPr>
+        <w:pStyle w:val="Absenderadresse"/>
         <w:rPr>
           <w:rFonts w:ascii="Arial" w:hAnsi="Arial" w:cs="Arial"/>
           <w:sz w:val="22"/>
           <w:szCs w:val="22"/>
           <w:lang w:val="it-CH"/>
         </w:rPr>
-        <w:t xml:space="preserve"> GmbH</w:t>
+      </w:pPr>
+      <w:r>
+        <w:rPr>
+          <w:rFonts w:ascii="Arial" w:hAnsi="Arial" w:cs="Arial"/>
+          <w:sz w:val="22"/>
+          <w:szCs w:val="22"/>
+          <w:lang w:val="it-CH"/>
+        </w:rPr>
+        <w:t>Grabenstrasse 15a</w:t>
       </w:r>
     </w:p>
     <w:p>
@@ -112,7 +121,6 @@
           <w:lang w:val="it-CH"/>
         </w:rPr>
       </w:pPr>
-      <w:proofErr w:type="spellStart"/>
       <w:r>
         <w:rPr>
           <w:rFonts w:ascii="Arial" w:hAnsi="Arial" w:cs="Arial"/>
@@ -120,48 +128,18 @@
           <w:szCs w:val="22"/>
           <w:lang w:val="it-CH"/>
         </w:rPr>
-        <w:t>Grabenstrasse</w:t>
-      </w:r>
-      <w:proofErr w:type="spellEnd"/>
-      <w:r>
+        <w:t>6340 Baar</w:t>
+      </w:r>
+    </w:p>
+    <w:p>
+      <w:pPr>
+        <w:pStyle w:val="Absenderadresse"/>
         <w:rPr>
           <w:rFonts w:ascii="Arial" w:hAnsi="Arial" w:cs="Arial"/>
           <w:sz w:val="22"/>
           <w:szCs w:val="22"/>
           <w:lang w:val="it-CH"/>
         </w:rPr>
-        <w:t xml:space="preserve"> 15a</w:t>
-      </w:r>
-    </w:p>
-    <w:p>
-      <w:pPr>
-        <w:pStyle w:val="Absenderadresse"/>
-        <w:rPr>
-          <w:rFonts w:ascii="Arial" w:hAnsi="Arial" w:cs="Arial"/>
-          <w:sz w:val="22"/>
-          <w:szCs w:val="22"/>
-          <w:lang w:val="it-CH"/>
-        </w:rPr>
-      </w:pPr>
-      <w:r>
-        <w:rPr>
-          <w:rFonts w:ascii="Arial" w:hAnsi="Arial" w:cs="Arial"/>
-          <w:sz w:val="22"/>
-          <w:szCs w:val="22"/>
-          <w:lang w:val="it-CH"/>
-        </w:rPr>
-        <w:t>6340 Baar</w:t>
-      </w:r>
-    </w:p>
-    <w:p>
-      <w:pPr>
-        <w:pStyle w:val="Absenderadresse"/>
-        <w:rPr>
-          <w:rFonts w:ascii="Arial" w:hAnsi="Arial" w:cs="Arial"/>
-          <w:sz w:val="22"/>
-          <w:szCs w:val="22"/>
-          <w:lang w:val="it-CH"/>
-        </w:rPr>
       </w:pPr>
     </w:p>
     <w:p>
@@ -303,7 +281,7 @@
           <w:sz w:val="22"/>
           <w:szCs w:val="22"/>
         </w:rPr>
-        <w:t>April</w:t>
+        <w:t>März</w:t>
       </w:r>
       <w:r>
         <w:rPr>
@@ -364,242 +342,308 @@
         </w:rPr>
         <w:t>Pflichtversicherungen für Ihre neue Firma – jetzt in 3 Minuten online anfragen</w:t>
       </w:r>
-      <w:proofErr w:type="spellStart"/>
-      <w:r>
-        <w:rPr>
-          <w:rFonts w:ascii="Arial" w:hAnsi="Arial" w:cs="Arial"/>
+    </w:p>
+    <w:p>
+      <w:pPr>
+        <w:rPr>
+          <w:sz w:val="22"/>
+          <w:szCs w:val="22"/>
+        </w:rPr>
+      </w:pPr>
+    </w:p>
+    <w:p>
+      <w:pPr>
+        <w:rPr>
+          <w:sz w:val="22"/>
+          <w:szCs w:val="22"/>
+        </w:rPr>
+      </w:pPr>
+    </w:p>
+    <w:p>
+      <w:pPr>
+        <w:pStyle w:val="Emfngeradresse"/>
+        <w:rPr>
+          <w:rFonts w:ascii="Arial" w:hAnsi="Arial" w:cs="Arial"/>
+          <w:sz w:val="22"/>
+          <w:szCs w:val="22"/>
+          <w:lang w:val="de-CH"/>
+        </w:rPr>
+      </w:pPr>
+      <w:r>
+        <w:rPr>
+          <w:rFonts w:ascii="Arial" w:hAnsi="Arial" w:cs="Arial"/>
+          <w:sz w:val="22"/>
+          <w:szCs w:val="22"/>
+          <w:lang w:val="de-CH"/>
+        </w:rPr>
+        <w:t>Formelle Anrede</w:t>
+      </w:r>
+    </w:p>
+    <w:p>
+      <w:pPr>
+        <w:pStyle w:val="Emfngeradresse"/>
+        <w:rPr>
+          <w:rFonts w:ascii="Arial" w:hAnsi="Arial" w:cs="Arial"/>
+          <w:sz w:val="22"/>
+          <w:szCs w:val="22"/>
+          <w:lang w:val="de-CH"/>
+        </w:rPr>
+      </w:pPr>
+      <w:r>
+        <w:rPr>
+          <w:rFonts w:ascii="Arial" w:hAnsi="Arial" w:cs="Arial"/>
+          <w:sz w:val="22"/>
+          <w:szCs w:val="22"/>
+          <w:lang w:val="de-CH"/>
+        </w:rPr>
+        <w:t>Herzlichen Glückwunsch zur Gründung Ihrer Firma! Mit dem Handelsregistereintrag starten Sie Ihr Unternehmen – und gleichzeitig beginnen gesetzliche Versicherungspflichten, die Sie als Arbeitgeber einhalten müssen.</w:t>
+      </w:r>
+    </w:p>
+    <w:p>
+      <w:pPr>
+        <w:pStyle w:val="Emfngeradresse"/>
+        <w:rPr>
+          <w:rFonts w:ascii="Arial" w:hAnsi="Arial" w:cs="Arial"/>
+          <w:sz w:val="22"/>
+          <w:szCs w:val="22"/>
+          <w:lang w:val="de-CH"/>
+        </w:rPr>
+      </w:pPr>
+    </w:p>
+    <w:p>
+      <w:pPr>
+        <w:pStyle w:val="Emfngeradresse"/>
+        <w:rPr>
+          <w:rFonts w:ascii="Arial" w:hAnsi="Arial" w:cs="Arial"/>
+          <w:sz w:val="22"/>
+          <w:szCs w:val="22"/>
+          <w:lang w:val="de-CH"/>
+        </w:rPr>
+      </w:pPr>
+      <w:r>
+        <w:rPr>
           <w:b/>
-          <w:bCs/>
-          <w:sz w:val="22"/>
-          <w:szCs w:val="22"/>
-        </w:rPr>
-      </w:r>
-      <w:r>
-        <w:rPr>
-          <w:rFonts w:ascii="Arial" w:hAnsi="Arial" w:cs="Arial"/>
+        </w:rPr>
+        <w:t>Was für Ihre Firma jetzt gesetzlich gilt:</w:t>
+      </w:r>
+    </w:p>
+    <w:p>
+      <w:pPr>
+        <w:pStyle w:val="Emfngeradresse"/>
+        <w:rPr>
+          <w:rFonts w:ascii="Arial" w:hAnsi="Arial" w:cs="Arial"/>
+          <w:sz w:val="22"/>
+          <w:szCs w:val="22"/>
+          <w:lang w:val="de-CH"/>
+        </w:rPr>
+      </w:pPr>
+    </w:p>
+    <w:p>
+      <w:pPr>
+        <w:pStyle w:val="Emfngeradresse"/>
+        <w:rPr>
+          <w:rFonts w:ascii="Arial" w:hAnsi="Arial" w:cs="Arial"/>
+          <w:sz w:val="22"/>
+          <w:szCs w:val="22"/>
+          <w:lang w:val="de-CH"/>
+        </w:rPr>
+      </w:pPr>
+      <w:r>
+        <w:t>▪  UVG – Unfallversicherung: obligatorisch ab dem ersten Mitarbeitenden</w:t>
+      </w:r>
+    </w:p>
+    <w:p>
+      <w:pPr>
+        <w:pStyle w:val="Emfngeradresse"/>
+        <w:rPr>
+          <w:rFonts w:ascii="Arial" w:hAnsi="Arial" w:cs="Arial"/>
+          <w:sz w:val="22"/>
+          <w:szCs w:val="22"/>
+          <w:lang w:val="de-CH"/>
+        </w:rPr>
+      </w:pPr>
+      <w:r>
+        <w:t>▪  BVG / Pensionskasse – obligatorisch ab CHF 22 050 Jahreslohn</w:t>
+      </w:r>
+    </w:p>
+    <w:p>
+      <w:pPr>
+        <w:pStyle w:val="Emfngeradresse"/>
+        <w:rPr>
+          <w:rFonts w:ascii="Arial" w:hAnsi="Arial" w:cs="Arial"/>
+          <w:sz w:val="22"/>
+          <w:szCs w:val="22"/>
+          <w:lang w:val="de-CH"/>
+        </w:rPr>
+      </w:pPr>
+      <w:r>
+        <w:t>▪  KTG – Krankentaggeld: schützt Ihren Betrieb bei Lohnfortzahlung</w:t>
+      </w:r>
+    </w:p>
+    <w:p>
+      <w:pPr>
+        <w:pStyle w:val="Emfngeradresse"/>
+        <w:rPr>
+          <w:rFonts w:ascii="Arial" w:hAnsi="Arial" w:cs="Arial"/>
+          <w:sz w:val="22"/>
+          <w:szCs w:val="22"/>
+          <w:lang w:val="de-CH"/>
+        </w:rPr>
+      </w:pPr>
+      <w:r>
+        <w:t>▪  Berufshaftpflicht &amp; Rechtsschutz – für Ihre unternehmerische Sicherheit</w:t>
+      </w:r>
+    </w:p>
+    <w:p>
+      <w:pPr>
+        <w:pStyle w:val="Emfngeradresse"/>
+        <w:rPr>
+          <w:rFonts w:ascii="Arial" w:hAnsi="Arial" w:cs="Arial"/>
+          <w:sz w:val="22"/>
+          <w:szCs w:val="22"/>
+          <w:lang w:val="de-CH"/>
+        </w:rPr>
+      </w:pPr>
+    </w:p>
+    <w:p>
+      <w:pPr>
+        <w:pStyle w:val="Emfngeradresse"/>
+        <w:rPr>
+          <w:rFonts w:ascii="Arial" w:hAnsi="Arial" w:cs="Arial"/>
+          <w:sz w:val="22"/>
+          <w:szCs w:val="22"/>
+          <w:lang w:val="de-CH"/>
+        </w:rPr>
+      </w:pPr>
+      <w:r>
+        <w:t>Wir sind unabhängig von allen Versicherern – das bedeutet: Wir vergleichen für Sie den Markt und empfehlen nur, was wirklich zu Ihrem Unternehmen passt.</w:t>
+      </w:r>
+    </w:p>
+    <w:p>
+      <w:pPr>
+        <w:pStyle w:val="Emfngeradresse"/>
+        <w:rPr>
+          <w:rFonts w:ascii="Arial" w:hAnsi="Arial" w:cs="Arial"/>
+          <w:sz w:val="22"/>
+          <w:szCs w:val="22"/>
+          <w:lang w:val="de-CH"/>
+        </w:rPr>
+      </w:pPr>
+    </w:p>
+    <w:p>
+      <w:pPr>
+        <w:pStyle w:val="Emfngeradresse"/>
+        <w:rPr>
+          <w:rFonts w:ascii="Arial" w:hAnsi="Arial" w:cs="Arial"/>
+          <w:sz w:val="22"/>
+          <w:szCs w:val="22"/>
+          <w:lang w:val="de-CH"/>
+        </w:rPr>
+      </w:pPr>
+      <w:r>
+        <w:rPr>
           <w:b/>
-          <w:bCs/>
-          <w:sz w:val="22"/>
-          <w:szCs w:val="22"/>
-        </w:rPr>
-      </w:r>
-      <w:r>
-        <w:rPr>
-          <w:rFonts w:ascii="Arial" w:hAnsi="Arial" w:cs="Arial"/>
-          <w:b/>
-          <w:bCs/>
-          <w:sz w:val="22"/>
-          <w:szCs w:val="22"/>
-        </w:rPr>
-      </w:r>
-      <w:proofErr w:type="spellEnd"/>
-      <w:r>
-        <w:rPr>
-          <w:rFonts w:ascii="Arial" w:hAnsi="Arial" w:cs="Arial"/>
-          <w:b/>
-          <w:bCs/>
-          <w:sz w:val="22"/>
-          <w:szCs w:val="22"/>
-        </w:rPr>
-      </w:r>
-    </w:p>
-    <w:p>
-      <w:pPr>
-        <w:rPr>
-          <w:sz w:val="22"/>
-          <w:szCs w:val="22"/>
-        </w:rPr>
-      </w:pPr>
-    </w:p>
-    <w:p>
-      <w:pPr>
-        <w:rPr>
-          <w:sz w:val="22"/>
-          <w:szCs w:val="22"/>
-        </w:rPr>
-      </w:pPr>
-    </w:p>
-    <w:p>
-      <w:pPr>
-        <w:pStyle w:val="Emfngeradresse"/>
-        <w:rPr>
-          <w:rFonts w:ascii="Arial" w:hAnsi="Arial" w:cs="Arial"/>
-          <w:sz w:val="22"/>
-          <w:szCs w:val="22"/>
-          <w:lang w:val="de-CH"/>
-        </w:rPr>
-      </w:pPr>
-      <w:r>
-        <w:rPr>
-          <w:rFonts w:ascii="Arial" w:hAnsi="Arial" w:cs="Arial"/>
-          <w:sz w:val="22"/>
-          <w:szCs w:val="22"/>
-          <w:lang w:val="de-CH"/>
-        </w:rPr>
-        <w:t>Formelle Anrede</w:t>
-      </w:r>
-    </w:p>
-    <w:p>
-      <w:pPr>
-        <w:pStyle w:val="Emfngeradresse"/>
-      </w:pPr>
-      <w:r>
-        <w:rPr>
-          <w:b w:val="0"/>
-          <w:i w:val="0"/>
-        </w:rPr>
-        <w:t>Herzlichen Glückwunsch zur Gründung Ihrer Firma! Mit dem Handelsregistereintrag starten Sie Ihr Unternehmen – und gleichzeitig beginnen gesetzliche Versicherungspflichten, die Sie als Arbeitgeber einhalten müssen.</w:t>
-      </w:r>
-    </w:p>
-    <w:p>
-      <w:pPr>
-        <w:pStyle w:val="Emfngeradresse"/>
-      </w:pPr>
-    </w:p>
-    <w:p>
-      <w:pPr>
-        <w:pStyle w:val="Emfngeradresse"/>
-      </w:pPr>
-      <w:r>
-        <w:rPr>
-          <w:b/>
-          <w:i w:val="0"/>
-        </w:rPr>
-        <w:t>Was für Ihre Firma jetzt gesetzlich gilt:</w:t>
-      </w:r>
-    </w:p>
-    <w:p>
-      <w:pPr>
-        <w:pStyle w:val="Emfngeradresse"/>
-      </w:pPr>
-    </w:p>
-    <w:p>
-      <w:pPr>
-        <w:pStyle w:val="Emfngeradresse"/>
-      </w:pPr>
-      <w:r>
-        <w:t>▪  UVG – Unfallversicherung: obligatorisch ab dem ersten Mitarbeitenden</w:t>
-      </w:r>
-    </w:p>
-    <w:p>
-      <w:pPr>
-        <w:pStyle w:val="Emfngeradresse"/>
-      </w:pPr>
-      <w:r>
-        <w:t>▪  BVG / Pensionskasse – obligatorisch ab CHF 22 050 Jahreslohn</w:t>
-      </w:r>
-    </w:p>
-    <w:p>
-      <w:pPr>
-        <w:pStyle w:val="Emfngeradresse"/>
-      </w:pPr>
-      <w:r>
-        <w:t>▪  KTG – Krankentaggeld: schützt Ihren Betrieb bei Lohnfortzahlung</w:t>
-      </w:r>
-    </w:p>
-    <w:p>
-      <w:pPr>
-        <w:pStyle w:val="Emfngeradresse"/>
-      </w:pPr>
-      <w:r>
-        <w:t>▪  Berufshaftpflicht &amp; Rechtsschutz – für Ihre unternehmerische Sicherheit</w:t>
-      </w:r>
-    </w:p>
-    <w:p>
-      <w:pPr>
-        <w:pStyle w:val="Emfngeradresse"/>
-      </w:pPr>
-    </w:p>
-    <w:p>
-      <w:pPr>
-        <w:pStyle w:val="Emfngeradresse"/>
-      </w:pPr>
-      <w:r>
-        <w:rPr>
-          <w:b w:val="0"/>
-          <w:i w:val="0"/>
-        </w:rPr>
-        <w:t>Wir sind unabhängig von allen Versicherern – das bedeutet: Wir vergleichen für Sie den Markt und empfehlen nur, was wirklich zu Ihrem Unternehmen passt.</w:t>
-      </w:r>
-    </w:p>
-    <w:p>
-      <w:pPr>
-        <w:pStyle w:val="Emfngeradresse"/>
-      </w:pPr>
-    </w:p>
-    <w:p>
-      <w:pPr>
-        <w:pStyle w:val="Emfngeradresse"/>
-      </w:pPr>
-      <w:r>
-        <w:rPr>
-          <w:b/>
-          <w:i w:val="0"/>
-        </w:rPr>
-        <w:t>100 % online – ohne Termin, ohne Papierkram:</w:t>
-      </w:r>
-    </w:p>
-    <w:p>
-      <w:pPr>
-        <w:pStyle w:val="Emfngeradresse"/>
-      </w:pPr>
-    </w:p>
-    <w:p>
-      <w:pPr>
-        <w:pStyle w:val="Emfngeradresse"/>
-      </w:pPr>
-      <w:r>
-        <w:rPr>
-          <w:b w:val="0"/>
-          <w:i w:val="0"/>
-        </w:rPr>
-        <w:t xml:space="preserve">Besuchen Sie uns auf </w:t>
-      </w:r>
-      <w:r>
-        <w:rPr>
-          <w:b/>
-          <w:i w:val="0"/>
-        </w:rPr>
-        <w:t>www.confidio.ch</w:t>
-      </w:r>
-      <w:r>
-        <w:rPr>
-          <w:b w:val="0"/>
-          <w:i w:val="0"/>
-        </w:rPr>
-        <w:t>, füllen Sie unsere Offertanfrage in wenigen Minuten aus und erhalten Sie ein massgeschneidertes Angebot. Den Vertrag unterzeichnen Sie anschliessend bequem digital.</w:t>
-      </w:r>
-    </w:p>
-    <w:p>
-      <w:pPr>
-        <w:pStyle w:val="Emfngeradresse"/>
-      </w:pPr>
-    </w:p>
-    <w:p>
-      <w:pPr>
-        <w:pStyle w:val="Emfngeradresse"/>
-      </w:pPr>
-      <w:r>
-        <w:rPr>
-          <w:b w:val="0"/>
-          <w:i w:val="0"/>
-        </w:rPr>
+        </w:rPr>
+        <w:t>100 % online – ohne Termin, ohne Papierkram:</w:t>
+      </w:r>
+    </w:p>
+    <w:p>
+      <w:pPr>
+        <w:pStyle w:val="Emfngeradresse"/>
+        <w:rPr>
+          <w:rFonts w:ascii="Arial" w:hAnsi="Arial" w:cs="Arial"/>
+          <w:sz w:val="22"/>
+          <w:szCs w:val="22"/>
+          <w:lang w:val="de-CH"/>
+        </w:rPr>
+      </w:pPr>
+    </w:p>
+    <w:p>
+      <w:pPr>
+        <w:pStyle w:val="Emfngeradresse"/>
+        <w:rPr>
+          <w:rFonts w:ascii="Arial" w:hAnsi="Arial" w:cs="Arial"/>
+          <w:sz w:val="22"/>
+          <w:szCs w:val="22"/>
+          <w:lang w:val="de-CH"/>
+        </w:rPr>
+      </w:pPr>
+      <w:r>
+        <w:t>Besuchen Sie uns auf www.confidio.ch, füllen Sie unsere Offertanfrage in wenigen Minuten aus und erhalten Sie ein massgeschneidertes Angebot. Den Vertrag unterzeichnen Sie anschliessend bequem digital.</w:t>
+      </w:r>
+    </w:p>
+    <w:p>
+      <w:pPr>
+        <w:pStyle w:val="Emfngeradresse"/>
+        <w:rPr>
+          <w:rFonts w:ascii="Arial" w:hAnsi="Arial" w:cs="Arial"/>
+          <w:sz w:val="22"/>
+          <w:szCs w:val="22"/>
+          <w:lang w:val="de-CH"/>
+        </w:rPr>
+      </w:pPr>
+    </w:p>
+    <w:p>
+      <w:pPr>
+        <w:pStyle w:val="Emfngeradresse"/>
+        <w:rPr>
+          <w:rFonts w:ascii="Arial" w:hAnsi="Arial" w:cs="Arial"/>
+          <w:sz w:val="22"/>
+          <w:szCs w:val="22"/>
+          <w:lang w:val="de-CH"/>
+        </w:rPr>
+      </w:pPr>
+      <w:r>
         <w:t>Wir freuen uns, Sie auf Ihrem unternehmerischen Weg zu begleiten.</w:t>
       </w:r>
     </w:p>
     <w:p>
       <w:pPr>
         <w:pStyle w:val="Emfngeradresse"/>
-      </w:pPr>
-    </w:p>
-    <w:p>
-      <w:pPr>
-        <w:pStyle w:val="Emfngeradresse"/>
-      </w:pPr>
-      <w:r>
-        <w:rPr>
-          <w:b w:val="0"/>
-          <w:i w:val="0"/>
+        <w:rPr>
+          <w:rFonts w:ascii="Arial" w:hAnsi="Arial" w:cs="Arial"/>
+          <w:sz w:val="22"/>
+          <w:szCs w:val="22"/>
+          <w:lang w:val="de-CH"/>
+        </w:rPr>
+      </w:pPr>
+    </w:p>
+    <w:p>
+      <w:pPr>
+        <w:pStyle w:val="Emfngeradresse"/>
+        <w:rPr>
+          <w:rFonts w:ascii="Arial" w:hAnsi="Arial" w:cs="Arial"/>
+          <w:sz w:val="22"/>
+          <w:szCs w:val="22"/>
+          <w:lang w:val="de-CH"/>
+        </w:rPr>
+      </w:pPr>
+    </w:p>
+    <w:p>
+      <w:pPr>
+        <w:pStyle w:val="Emfngeradresse"/>
+        <w:rPr>
+          <w:rFonts w:ascii="Arial" w:hAnsi="Arial" w:cs="Arial"/>
+          <w:sz w:val="22"/>
+          <w:szCs w:val="22"/>
+          <w:lang w:val="de-CH"/>
+        </w:rPr>
+      </w:pPr>
+      <w:r>
+        <w:rPr>
+          <w:rFonts w:ascii="Arial" w:hAnsi="Arial" w:cs="Arial"/>
+          <w:sz w:val="22"/>
+          <w:szCs w:val="22"/>
+          <w:lang w:val="de-CH"/>
+        </w:rPr>
+        <w:br/>
+      </w:r>
+      <w:r>
+        <w:rPr>
+          <w:rFonts w:ascii="Arial" w:hAnsi="Arial" w:cs="Arial"/>
+          <w:sz w:val="22"/>
+          <w:szCs w:val="22"/>
+          <w:lang w:val="de-CH"/>
         </w:rPr>
         <w:t>Freundliche Grüsse</w:t>
       </w:r>
@@ -607,58 +651,524 @@
     <w:p>
       <w:pPr>
         <w:pStyle w:val="Emfngeradresse"/>
-      </w:pPr>
-      <w:r>
-        <w:rPr>
-          <w:b w:val="0"/>
-          <w:i w:val="0"/>
-        </w:rPr>
-        <w:t>Ihr Confidio Team</w:t>
-      </w:r>
-    </w:p>
-    <w:p>
-      <w:pPr>
-        <w:pStyle w:val="Emfngeradresse"/>
-      </w:pPr>
-    </w:p>
-    <w:p>
-      <w:pPr>
-        <w:pStyle w:val="Emfngeradresse"/>
-      </w:pPr>
-      <w:r>
-        <w:rPr>
-          <w:b w:val="0"/>
-          <w:i w:val="0"/>
-        </w:rPr>
-        <w:t xml:space="preserve">info@confidio.ch  |  </w:t>
-      </w:r>
-      <w:r>
-        <w:rPr>
-          <w:b/>
-          <w:i w:val="0"/>
-        </w:rPr>
-        <w:t>www.confidio.ch</w:t>
-      </w:r>
-    </w:p>
-    <w:p>
-      <w:pPr>
-        <w:pStyle w:val="Emfngeradresse"/>
-      </w:pPr>
-    </w:p>
-    <w:p>
-      <w:pPr>
-        <w:pStyle w:val="Emfngeradresse"/>
-      </w:pPr>
-      <w:r>
-        <w:rPr>
-          <w:b w:val="0"/>
-          <w:i/>
-        </w:rPr>
-        <w:t>Sie möchten keine weiteren Zuschriften von uns? Schreiben Sie uns an info@confidio.ch – wir entfernen Sie umgehend aus unserem Verteiler.</w:t>
+        <w:rPr>
+          <w:rFonts w:ascii="Arial" w:hAnsi="Arial" w:cs="Arial"/>
+          <w:sz w:val="22"/>
+          <w:szCs w:val="22"/>
+          <w:lang w:val="de-CH"/>
+        </w:rPr>
+      </w:pPr>
+    </w:p>
+    <w:p>
+      <w:pPr>
+        <w:pStyle w:val="Emfngeradresse"/>
+        <w:rPr>
+          <w:rFonts w:ascii="Arial" w:hAnsi="Arial" w:cs="Arial"/>
+          <w:sz w:val="22"/>
+          <w:szCs w:val="22"/>
+        </w:rPr>
+      </w:pPr>
+      <w:r>
+        <w:rPr>
+          <w:noProof/>
+          <w:sz w:val="22"/>
+          <w:szCs w:val="22"/>
+        </w:rPr>
+        <w:drawing>
+          <wp:anchor distT="0" distB="0" distL="114300" distR="114300" simplePos="0" relativeHeight="251665408" behindDoc="1" locked="0" layoutInCell="1" allowOverlap="1" wp14:anchorId="243B0D16" wp14:editId="731A3BD0">
+            <wp:simplePos x="0" y="0"/>
+            <wp:positionH relativeFrom="margin">
+              <wp:posOffset>3903132</wp:posOffset>
+            </wp:positionH>
+            <wp:positionV relativeFrom="paragraph">
+              <wp:posOffset>919267</wp:posOffset>
+            </wp:positionV>
+            <wp:extent cx="689751" cy="293511"/>
+            <wp:effectExtent l="0" t="0" r="0" b="0"/>
+            <wp:wrapNone/>
+            <wp:docPr id="17" name="Bild 17"/>
+            <wp:cNvGraphicFramePr>
+              <a:graphicFrameLocks xmlns:a="http://schemas.openxmlformats.org/drawingml/2006/main" noChangeAspect="1"/>
+            </wp:cNvGraphicFramePr>
+            <a:graphic xmlns:a="http://schemas.openxmlformats.org/drawingml/2006/main">
+              <a:graphicData uri="http://schemas.openxmlformats.org/drawingml/2006/picture">
+                <pic:pic xmlns:pic="http://schemas.openxmlformats.org/drawingml/2006/picture">
+                  <pic:nvPicPr>
+                    <pic:cNvPr id="17" name="Bild 17"/>
+                    <pic:cNvPicPr>
+                      <a:picLocks noChangeAspect="1" noChangeArrowheads="1"/>
+                    </pic:cNvPicPr>
+                  </pic:nvPicPr>
+                  <pic:blipFill>
+                    <a:blip r:embed="rId11" cstate="print">
+                      <a:extLst>
+                        <a:ext uri="{28A0092B-C50C-407E-A947-70E740481C1C}">
+                          <a14:useLocalDpi xmlns:a14="http://schemas.microsoft.com/office/drawing/2010/main" val="0"/>
+                        </a:ext>
+                      </a:extLst>
+                    </a:blip>
+                    <a:stretch>
+                      <a:fillRect/>
+                    </a:stretch>
+                  </pic:blipFill>
+                  <pic:spPr bwMode="auto">
+                    <a:xfrm>
+                      <a:off x="0" y="0"/>
+                      <a:ext cx="710554" cy="302363"/>
+                    </a:xfrm>
+                    <a:prstGeom prst="rect">
+                      <a:avLst/>
+                    </a:prstGeom>
+                    <a:noFill/>
+                    <a:ln>
+                      <a:noFill/>
+                    </a:ln>
+                  </pic:spPr>
+                </pic:pic>
+              </a:graphicData>
+            </a:graphic>
+            <wp14:sizeRelH relativeFrom="margin">
+              <wp14:pctWidth>0</wp14:pctWidth>
+            </wp14:sizeRelH>
+            <wp14:sizeRelV relativeFrom="margin">
+              <wp14:pctHeight>0</wp14:pctHeight>
+            </wp14:sizeRelV>
+          </wp:anchor>
+        </w:drawing>
+      </w:r>
+      <w:r>
+        <w:rPr>
+          <w:noProof/>
+          <w:sz w:val="22"/>
+          <w:szCs w:val="22"/>
+        </w:rPr>
+        <w:drawing>
+          <wp:anchor distT="0" distB="0" distL="114300" distR="114300" simplePos="0" relativeHeight="251662336" behindDoc="1" locked="0" layoutInCell="1" allowOverlap="1" wp14:anchorId="399B35B4" wp14:editId="0F6AFDA1">
+            <wp:simplePos x="0" y="0"/>
+            <wp:positionH relativeFrom="margin">
+              <wp:posOffset>2841695</wp:posOffset>
+            </wp:positionH>
+            <wp:positionV relativeFrom="paragraph">
+              <wp:posOffset>323215</wp:posOffset>
+            </wp:positionV>
+            <wp:extent cx="1223285" cy="416681"/>
+            <wp:effectExtent l="0" t="0" r="0" b="2540"/>
+            <wp:wrapNone/>
+            <wp:docPr id="12" name="Bild 12"/>
+            <wp:cNvGraphicFramePr>
+              <a:graphicFrameLocks xmlns:a="http://schemas.openxmlformats.org/drawingml/2006/main" noChangeAspect="1"/>
+            </wp:cNvGraphicFramePr>
+            <a:graphic xmlns:a="http://schemas.openxmlformats.org/drawingml/2006/main">
+              <a:graphicData uri="http://schemas.openxmlformats.org/drawingml/2006/picture">
+                <pic:pic xmlns:pic="http://schemas.openxmlformats.org/drawingml/2006/picture">
+                  <pic:nvPicPr>
+                    <pic:cNvPr id="12" name="Bild 12"/>
+                    <pic:cNvPicPr>
+                      <a:picLocks noChangeAspect="1" noChangeArrowheads="1"/>
+                    </pic:cNvPicPr>
+                  </pic:nvPicPr>
+                  <pic:blipFill>
+                    <a:blip r:embed="rId12" cstate="print">
+                      <a:extLst>
+                        <a:ext uri="{28A0092B-C50C-407E-A947-70E740481C1C}">
+                          <a14:useLocalDpi xmlns:a14="http://schemas.microsoft.com/office/drawing/2010/main" val="0"/>
+                        </a:ext>
+                      </a:extLst>
+                    </a:blip>
+                    <a:stretch>
+                      <a:fillRect/>
+                    </a:stretch>
+                  </pic:blipFill>
+                  <pic:spPr bwMode="auto">
+                    <a:xfrm>
+                      <a:off x="0" y="0"/>
+                      <a:ext cx="1223285" cy="416681"/>
+                    </a:xfrm>
+                    <a:prstGeom prst="rect">
+                      <a:avLst/>
+                    </a:prstGeom>
+                    <a:noFill/>
+                    <a:ln>
+                      <a:noFill/>
+                    </a:ln>
+                  </pic:spPr>
+                </pic:pic>
+              </a:graphicData>
+            </a:graphic>
+            <wp14:sizeRelH relativeFrom="margin">
+              <wp14:pctWidth>0</wp14:pctWidth>
+            </wp14:sizeRelH>
+            <wp14:sizeRelV relativeFrom="margin">
+              <wp14:pctHeight>0</wp14:pctHeight>
+            </wp14:sizeRelV>
+          </wp:anchor>
+        </w:drawing>
+      </w:r>
+      <w:r>
+        <w:rPr>
+          <w:noProof/>
+          <w:sz w:val="22"/>
+          <w:szCs w:val="22"/>
+        </w:rPr>
+        <w:drawing>
+          <wp:anchor distT="0" distB="0" distL="114300" distR="114300" simplePos="0" relativeHeight="251664384" behindDoc="1" locked="0" layoutInCell="1" allowOverlap="1" wp14:anchorId="24029FC9" wp14:editId="26B52C23">
+            <wp:simplePos x="0" y="0"/>
+            <wp:positionH relativeFrom="margin">
+              <wp:posOffset>2074334</wp:posOffset>
+            </wp:positionH>
+            <wp:positionV relativeFrom="paragraph">
+              <wp:posOffset>970069</wp:posOffset>
+            </wp:positionV>
+            <wp:extent cx="1207911" cy="243094"/>
+            <wp:effectExtent l="0" t="0" r="0" b="0"/>
+            <wp:wrapNone/>
+            <wp:docPr id="15" name="Bild 15"/>
+            <wp:cNvGraphicFramePr>
+              <a:graphicFrameLocks xmlns:a="http://schemas.openxmlformats.org/drawingml/2006/main" noChangeAspect="1"/>
+            </wp:cNvGraphicFramePr>
+            <a:graphic xmlns:a="http://schemas.openxmlformats.org/drawingml/2006/main">
+              <a:graphicData uri="http://schemas.openxmlformats.org/drawingml/2006/picture">
+                <pic:pic xmlns:pic="http://schemas.openxmlformats.org/drawingml/2006/picture">
+                  <pic:nvPicPr>
+                    <pic:cNvPr id="15" name="Bild 15"/>
+                    <pic:cNvPicPr>
+                      <a:picLocks noChangeAspect="1" noChangeArrowheads="1"/>
+                    </pic:cNvPicPr>
+                  </pic:nvPicPr>
+                  <pic:blipFill>
+                    <a:blip r:embed="rId13" cstate="print">
+                      <a:extLst>
+                        <a:ext uri="{28A0092B-C50C-407E-A947-70E740481C1C}">
+                          <a14:useLocalDpi xmlns:a14="http://schemas.microsoft.com/office/drawing/2010/main" val="0"/>
+                        </a:ext>
+                      </a:extLst>
+                    </a:blip>
+                    <a:stretch>
+                      <a:fillRect/>
+                    </a:stretch>
+                  </pic:blipFill>
+                  <pic:spPr bwMode="auto">
+                    <a:xfrm>
+                      <a:off x="0" y="0"/>
+                      <a:ext cx="1207911" cy="243094"/>
+                    </a:xfrm>
+                    <a:prstGeom prst="rect">
+                      <a:avLst/>
+                    </a:prstGeom>
+                    <a:noFill/>
+                    <a:ln>
+                      <a:noFill/>
+                    </a:ln>
+                  </pic:spPr>
+                </pic:pic>
+              </a:graphicData>
+            </a:graphic>
+            <wp14:sizeRelH relativeFrom="margin">
+              <wp14:pctWidth>0</wp14:pctWidth>
+            </wp14:sizeRelH>
+            <wp14:sizeRelV relativeFrom="margin">
+              <wp14:pctHeight>0</wp14:pctHeight>
+            </wp14:sizeRelV>
+          </wp:anchor>
+        </w:drawing>
+      </w:r>
+      <w:r>
+        <w:rPr>
+          <w:noProof/>
+          <w:sz w:val="22"/>
+          <w:szCs w:val="22"/>
+        </w:rPr>
+        <w:drawing>
+          <wp:anchor distT="0" distB="0" distL="114300" distR="114300" simplePos="0" relativeHeight="251661312" behindDoc="1" locked="0" layoutInCell="1" allowOverlap="1" wp14:anchorId="58DCB06F" wp14:editId="2F273D6A">
+            <wp:simplePos x="0" y="0"/>
+            <wp:positionH relativeFrom="margin">
+              <wp:posOffset>606778</wp:posOffset>
+            </wp:positionH>
+            <wp:positionV relativeFrom="paragraph">
+              <wp:posOffset>907979</wp:posOffset>
+            </wp:positionV>
+            <wp:extent cx="909947" cy="304942"/>
+            <wp:effectExtent l="0" t="0" r="5080" b="0"/>
+            <wp:wrapNone/>
+            <wp:docPr id="10" name="Bild 10"/>
+            <wp:cNvGraphicFramePr>
+              <a:graphicFrameLocks xmlns:a="http://schemas.openxmlformats.org/drawingml/2006/main" noChangeAspect="1"/>
+            </wp:cNvGraphicFramePr>
+            <a:graphic xmlns:a="http://schemas.openxmlformats.org/drawingml/2006/main">
+              <a:graphicData uri="http://schemas.openxmlformats.org/drawingml/2006/picture">
+                <pic:pic xmlns:pic="http://schemas.openxmlformats.org/drawingml/2006/picture">
+                  <pic:nvPicPr>
+                    <pic:cNvPr id="10" name="Bild 10"/>
+                    <pic:cNvPicPr>
+                      <a:picLocks noChangeAspect="1" noChangeArrowheads="1"/>
+                    </pic:cNvPicPr>
+                  </pic:nvPicPr>
+                  <pic:blipFill>
+                    <a:blip r:embed="rId14" cstate="print">
+                      <a:extLst>
+                        <a:ext uri="{28A0092B-C50C-407E-A947-70E740481C1C}">
+                          <a14:useLocalDpi xmlns:a14="http://schemas.microsoft.com/office/drawing/2010/main" val="0"/>
+                        </a:ext>
+                      </a:extLst>
+                    </a:blip>
+                    <a:stretch>
+                      <a:fillRect/>
+                    </a:stretch>
+                  </pic:blipFill>
+                  <pic:spPr bwMode="auto">
+                    <a:xfrm>
+                      <a:off x="0" y="0"/>
+                      <a:ext cx="916141" cy="307018"/>
+                    </a:xfrm>
+                    <a:prstGeom prst="rect">
+                      <a:avLst/>
+                    </a:prstGeom>
+                    <a:noFill/>
+                    <a:ln>
+                      <a:noFill/>
+                    </a:ln>
+                  </pic:spPr>
+                </pic:pic>
+              </a:graphicData>
+            </a:graphic>
+            <wp14:sizeRelH relativeFrom="margin">
+              <wp14:pctWidth>0</wp14:pctWidth>
+            </wp14:sizeRelH>
+            <wp14:sizeRelV relativeFrom="margin">
+              <wp14:pctHeight>0</wp14:pctHeight>
+            </wp14:sizeRelV>
+          </wp:anchor>
+        </w:drawing>
+      </w:r>
+      <w:r>
+        <w:rPr>
+          <w:noProof/>
+          <w:sz w:val="22"/>
+          <w:szCs w:val="22"/>
+        </w:rPr>
+        <w:drawing>
+          <wp:anchor distT="0" distB="0" distL="114300" distR="114300" simplePos="0" relativeHeight="251663360" behindDoc="1" locked="0" layoutInCell="1" allowOverlap="1" wp14:anchorId="6B7AF49F" wp14:editId="7A76805C">
+            <wp:simplePos x="0" y="0"/>
+            <wp:positionH relativeFrom="margin">
+              <wp:posOffset>944880</wp:posOffset>
+            </wp:positionH>
+            <wp:positionV relativeFrom="paragraph">
+              <wp:posOffset>264160</wp:posOffset>
+            </wp:positionV>
+            <wp:extent cx="1595755" cy="530225"/>
+            <wp:effectExtent l="0" t="0" r="4445" b="3175"/>
+            <wp:wrapNone/>
+            <wp:docPr id="14" name="Bild 14"/>
+            <wp:cNvGraphicFramePr>
+              <a:graphicFrameLocks xmlns:a="http://schemas.openxmlformats.org/drawingml/2006/main" noChangeAspect="1"/>
+            </wp:cNvGraphicFramePr>
+            <a:graphic xmlns:a="http://schemas.openxmlformats.org/drawingml/2006/main">
+              <a:graphicData uri="http://schemas.openxmlformats.org/drawingml/2006/picture">
+                <pic:pic xmlns:pic="http://schemas.openxmlformats.org/drawingml/2006/picture">
+                  <pic:nvPicPr>
+                    <pic:cNvPr id="14" name="Bild 14"/>
+                    <pic:cNvPicPr>
+                      <a:picLocks noChangeAspect="1" noChangeArrowheads="1"/>
+                    </pic:cNvPicPr>
+                  </pic:nvPicPr>
+                  <pic:blipFill rotWithShape="1">
+                    <a:blip r:embed="rId15" cstate="print">
+                      <a:extLst>
+                        <a:ext uri="{28A0092B-C50C-407E-A947-70E740481C1C}">
+                          <a14:useLocalDpi xmlns:a14="http://schemas.microsoft.com/office/drawing/2010/main" val="0"/>
+                        </a:ext>
+                      </a:extLst>
+                    </a:blip>
+                    <a:srcRect t="31833" b="34941"/>
+                    <a:stretch/>
+                  </pic:blipFill>
+                  <pic:spPr bwMode="auto">
+                    <a:xfrm>
+                      <a:off x="0" y="0"/>
+                      <a:ext cx="1595755" cy="530225"/>
+                    </a:xfrm>
+                    <a:prstGeom prst="rect">
+                      <a:avLst/>
+                    </a:prstGeom>
+                    <a:noFill/>
+                    <a:ln>
+                      <a:noFill/>
+                    </a:ln>
+                    <a:extLst>
+                      <a:ext uri="{53640926-AAD7-44D8-BBD7-CCE9431645EC}">
+                        <a14:shadowObscured xmlns:a14="http://schemas.microsoft.com/office/drawing/2010/main"/>
+                      </a:ext>
+                    </a:extLst>
+                  </pic:spPr>
+                </pic:pic>
+              </a:graphicData>
+            </a:graphic>
+            <wp14:sizeRelH relativeFrom="margin">
+              <wp14:pctWidth>0</wp14:pctWidth>
+            </wp14:sizeRelH>
+            <wp14:sizeRelV relativeFrom="margin">
+              <wp14:pctHeight>0</wp14:pctHeight>
+            </wp14:sizeRelV>
+          </wp:anchor>
+        </w:drawing>
+      </w:r>
+      <w:r>
+        <w:rPr>
+          <w:rFonts w:ascii="Arial" w:hAnsi="Arial" w:cs="Arial"/>
+          <w:noProof/>
+          <w:sz w:val="22"/>
+          <w:szCs w:val="22"/>
+          <w:lang w:val="de-CH"/>
+        </w:rPr>
+        <w:drawing>
+          <wp:anchor distT="0" distB="0" distL="114300" distR="114300" simplePos="0" relativeHeight="251659264" behindDoc="1" locked="0" layoutInCell="1" allowOverlap="1" wp14:anchorId="1A6AD88D" wp14:editId="6892247C">
+            <wp:simplePos x="0" y="0"/>
+            <wp:positionH relativeFrom="margin">
+              <wp:posOffset>-386433</wp:posOffset>
+            </wp:positionH>
+            <wp:positionV relativeFrom="paragraph">
+              <wp:posOffset>263736</wp:posOffset>
+            </wp:positionV>
+            <wp:extent cx="925689" cy="644384"/>
+            <wp:effectExtent l="0" t="0" r="1905" b="3810"/>
+            <wp:wrapNone/>
+            <wp:docPr id="1944560991" name="Grafik 1"/>
+            <wp:cNvGraphicFramePr>
+              <a:graphicFrameLocks xmlns:a="http://schemas.openxmlformats.org/drawingml/2006/main" noChangeAspect="1"/>
+            </wp:cNvGraphicFramePr>
+            <a:graphic xmlns:a="http://schemas.openxmlformats.org/drawingml/2006/main">
+              <a:graphicData uri="http://schemas.openxmlformats.org/drawingml/2006/picture">
+                <pic:pic xmlns:pic="http://schemas.openxmlformats.org/drawingml/2006/picture">
+                  <pic:nvPicPr>
+                    <pic:cNvPr id="1944560991" name="Grafik 1"/>
+                    <pic:cNvPicPr>
+                      <a:picLocks noChangeAspect="1" noChangeArrowheads="1"/>
+                    </pic:cNvPicPr>
+                  </pic:nvPicPr>
+                  <pic:blipFill>
+                    <a:blip r:embed="rId16" cstate="print">
+                      <a:extLst>
+                        <a:ext uri="{28A0092B-C50C-407E-A947-70E740481C1C}">
+                          <a14:useLocalDpi xmlns:a14="http://schemas.microsoft.com/office/drawing/2010/main" val="0"/>
+                        </a:ext>
+                      </a:extLst>
+                    </a:blip>
+                    <a:stretch>
+                      <a:fillRect/>
+                    </a:stretch>
+                  </pic:blipFill>
+                  <pic:spPr bwMode="auto">
+                    <a:xfrm>
+                      <a:off x="0" y="0"/>
+                      <a:ext cx="925689" cy="644384"/>
+                    </a:xfrm>
+                    <a:prstGeom prst="rect">
+                      <a:avLst/>
+                    </a:prstGeom>
+                    <a:noFill/>
+                  </pic:spPr>
+                </pic:pic>
+              </a:graphicData>
+            </a:graphic>
+            <wp14:sizeRelH relativeFrom="margin">
+              <wp14:pctWidth>0</wp14:pctWidth>
+            </wp14:sizeRelH>
+            <wp14:sizeRelV relativeFrom="margin">
+              <wp14:pctHeight>0</wp14:pctHeight>
+            </wp14:sizeRelV>
+          </wp:anchor>
+        </w:drawing>
+      </w:r>
+      <w:r>
+        <w:rPr>
+          <w:noProof/>
+          <w:sz w:val="22"/>
+          <w:szCs w:val="22"/>
+        </w:rPr>
+        <w:drawing>
+          <wp:anchor distT="0" distB="0" distL="114300" distR="114300" simplePos="0" relativeHeight="251660288" behindDoc="1" locked="0" layoutInCell="1" allowOverlap="1" wp14:anchorId="514F9D37" wp14:editId="5A3C15AF">
+            <wp:simplePos x="0" y="0"/>
+            <wp:positionH relativeFrom="margin">
+              <wp:posOffset>4448175</wp:posOffset>
+            </wp:positionH>
+            <wp:positionV relativeFrom="paragraph">
+              <wp:posOffset>445770</wp:posOffset>
+            </wp:positionV>
+            <wp:extent cx="1152525" cy="316944"/>
+            <wp:effectExtent l="0" t="0" r="0" b="6985"/>
+            <wp:wrapNone/>
+            <wp:docPr id="8" name="Bild 8" descr="Ein Bild, das Schrift, Text, Grafiken, Typografie enthält.&#10;&#10;Automatisch generierte Beschreibung"/>
+            <wp:cNvGraphicFramePr>
+              <a:graphicFrameLocks xmlns:a="http://schemas.openxmlformats.org/drawingml/2006/main" noChangeAspect="1"/>
+            </wp:cNvGraphicFramePr>
+            <a:graphic xmlns:a="http://schemas.openxmlformats.org/drawingml/2006/main">
+              <a:graphicData uri="http://schemas.openxmlformats.org/drawingml/2006/picture">
+                <pic:pic xmlns:pic="http://schemas.openxmlformats.org/drawingml/2006/picture">
+                  <pic:nvPicPr>
+                    <pic:cNvPr id="8" name="Bild 8" descr="Ein Bild, das Schrift, Text, Grafiken, Typografie enthält.&#10;&#10;Automatisch generierte Beschreibung"/>
+                    <pic:cNvPicPr>
+                      <a:picLocks noChangeAspect="1" noChangeArrowheads="1"/>
+                    </pic:cNvPicPr>
+                  </pic:nvPicPr>
+                  <pic:blipFill>
+                    <a:blip r:embed="rId17" cstate="print">
+                      <a:extLst>
+                        <a:ext uri="{28A0092B-C50C-407E-A947-70E740481C1C}">
+                          <a14:useLocalDpi xmlns:a14="http://schemas.microsoft.com/office/drawing/2010/main" val="0"/>
+                        </a:ext>
+                      </a:extLst>
+                    </a:blip>
+                    <a:srcRect/>
+                    <a:stretch>
+                      <a:fillRect/>
+                    </a:stretch>
+                  </pic:blipFill>
+                  <pic:spPr bwMode="auto">
+                    <a:xfrm>
+                      <a:off x="0" y="0"/>
+                      <a:ext cx="1152525" cy="316944"/>
+                    </a:xfrm>
+                    <a:prstGeom prst="rect">
+                      <a:avLst/>
+                    </a:prstGeom>
+                    <a:noFill/>
+                    <a:ln>
+                      <a:noFill/>
+                    </a:ln>
+                  </pic:spPr>
+                </pic:pic>
+              </a:graphicData>
+            </a:graphic>
+            <wp14:sizeRelH relativeFrom="margin">
+              <wp14:pctWidth>0</wp14:pctWidth>
+            </wp14:sizeRelH>
+            <wp14:sizeRelV relativeFrom="margin">
+              <wp14:pctHeight>0</wp14:pctHeight>
+            </wp14:sizeRelV>
+          </wp:anchor>
+        </w:drawing>
+      </w:r>
+      <w:r>
+        <w:rPr>
+          <w:rFonts w:ascii="Arial" w:hAnsi="Arial" w:cs="Arial"/>
+          <w:sz w:val="22"/>
+          <w:szCs w:val="22"/>
+          <w:lang w:val="de-CH"/>
+        </w:rPr>
+        <w:t xml:space="preserve">Ihr </w:t>
+      </w:r>
+      <w:r>
+        <w:rPr>
+          <w:rFonts w:ascii="Arial" w:hAnsi="Arial" w:cs="Arial"/>
+          <w:sz w:val="22"/>
+          <w:szCs w:val="22"/>
+          <w:lang w:val="de-CH"/>
+        </w:rPr>
+        <w:t>Confidio Team</w:t>
       </w:r>
     </w:p>
     <w:sectPr>
-      <w:footerReference w:type="default" r:id="rId19"/>
+      <w:footerReference w:type="default" r:id="rId18"/>
       <w:pgSz w:w="11907" w:h="16839"/>
       <w:pgMar w:top="1440" w:right="1800" w:bottom="1440" w:left="1800" w:header="720" w:footer="720" w:gutter="0"/>
       <w:pgBorders w:offsetFrom="page">
@@ -670,6 +1180,18 @@
       <w:cols w:space="708"/>
       <w:docGrid w:linePitch="360"/>
     </w:sectPr>
+    <w:p/>
+    <w:p>
+      <w:r>
+        <w:t>info@confidio.ch  |  www.confidio.ch</w:t>
+      </w:r>
+    </w:p>
+    <w:p/>
+    <w:p>
+      <w:r>
+        <w:t>Sie möchten keine weiteren Zuschriften von uns? Schreiben Sie uns an info@confidio.ch – wir entfernen Sie umgehend aus unserem Verteiler.</w:t>
+      </w:r>
+    </w:p>
   </w:body>
 </w:document>
 </file>
@@ -708,7 +1230,6 @@
         <w:lang w:val="it-IT"/>
       </w:rPr>
     </w:pPr>
-    <w:proofErr w:type="spellStart"/>
     <w:r>
       <w:rPr>
         <w:rFonts w:ascii="Arial" w:hAnsi="Arial" w:cs="Arial"/>
@@ -716,17 +1237,7 @@
         <w:szCs w:val="20"/>
         <w:lang w:val="it-IT"/>
       </w:rPr>
-      <w:t>Confidio</w:t>
-    </w:r>
-    <w:proofErr w:type="spellEnd"/>
-    <w:r>
-      <w:rPr>
-        <w:rFonts w:ascii="Arial" w:hAnsi="Arial" w:cs="Arial"/>
-        <w:sz w:val="20"/>
-        <w:szCs w:val="20"/>
-        <w:lang w:val="it-IT"/>
-      </w:rPr>
-      <w:t xml:space="preserve"> </w:t>
+      <w:t xml:space="preserve">Confidio </w:t>
     </w:r>
     <w:r>
       <w:rPr>

</xml_diff>